<commit_message>
fix(proposal): gyp base bid no longer claims "material sales tax INCLUDED"
The gyp PRICE section itemizes Base Bid + Material Sales Tax + Kansas Remodel
Tax + Total (Base + taxes = Total). But the gyp template HARDCODED "(material
sales tax INCLUDED)" on the base-bid line — contradicting the separately-added
tax lines (says tax is included, then adds it on top). The code already blanks
`base_tax_phrase` for the itemized/gyp path, but the gyp template was the only
one that hardcoded the phrase instead of using the {{base_tax_phrase}} token.

Tokenized the gyp template's base-bid line to {{base_tax_phrase}} (matching the
other 5 templates), so for gyp it renders empty: "$746,174.00 – Gypsum
Underlayment System as described above" with the itemized taxes summing to the
Total. Verified via the local container-render + PyMuPDF loop on Encore.

Co-Authored-By: Claude Fable 5 <noreply@anthropic.com>
</commit_message>
<xml_diff>
--- a/backend/templates/Gyp/xx TREADWELL UNDERLAYMENT PROPOSAL - xx.docx
+++ b/backend/templates/Gyp/xx TREADWELL UNDERLAYMENT PROPOSAL - xx.docx
@@ -7525,7 +7525,7 @@
                                 <w:sz w:val="20"/>
                                 <w:szCs w:val="20"/>
                               </w:rPr>
-                              <w:t xml:space="preserve">{{base_bid_formatted}} – Gypsum Underlayment System as described above (material sales tax INCLUDED)</w:t>
+                              <w:t xml:space="preserve">{{base_bid_formatted}} – Gypsum Underlayment System as described above {{base_tax_phrase}}</w:t>
                             </w:r>
                             <w:r>
                               <w:rPr>
@@ -8198,7 +8198,7 @@
                           <w:sz w:val="20"/>
                           <w:szCs w:val="20"/>
                         </w:rPr>
-                        <w:t xml:space="preserve">{{base_bid_formatted}} – Gypsum Underlayment System as described above (material sales tax INCLUDED)</w:t>
+                        <w:t xml:space="preserve">{{base_bid_formatted}} – Gypsum Underlayment System as described above {{base_tax_phrase}}</w:t>
                       </w:r>
                       <w:r>
                         <w:rPr>

</xml_diff>

<commit_message>
fix(proposal): gyp base bid no longer claims "material sales tax INCLUDED" (#148)
The gyp PRICE section itemizes Base Bid + Material Sales Tax + Kansas Remodel
Tax + Total (Base + taxes = Total). But the gyp template HARDCODED "(material
sales tax INCLUDED)" on the base-bid line — contradicting the separately-added
tax lines (says tax is included, then adds it on top). The code already blanks
`base_tax_phrase` for the itemized/gyp path, but the gyp template was the only
one that hardcoded the phrase instead of using the {{base_tax_phrase}} token.

Tokenized the gyp template's base-bid line to {{base_tax_phrase}} (matching the
other 5 templates), so for gyp it renders empty: "$746,174.00 – Gypsum
Underlayment System as described above" with the itemized taxes summing to the
Total. Verified via the local container-render + PyMuPDF loop on Encore.

Co-authored-by: internz2026-sys <internz.2026@gmail.com>
Co-authored-by: Claude Fable 5 <noreply@anthropic.com>
</commit_message>
<xml_diff>
--- a/backend/templates/Gyp/xx TREADWELL UNDERLAYMENT PROPOSAL - xx.docx
+++ b/backend/templates/Gyp/xx TREADWELL UNDERLAYMENT PROPOSAL - xx.docx
@@ -7525,7 +7525,7 @@
                                 <w:sz w:val="20"/>
                                 <w:szCs w:val="20"/>
                               </w:rPr>
-                              <w:t xml:space="preserve">{{base_bid_formatted}} – Gypsum Underlayment System as described above (material sales tax INCLUDED)</w:t>
+                              <w:t xml:space="preserve">{{base_bid_formatted}} – Gypsum Underlayment System as described above {{base_tax_phrase}}</w:t>
                             </w:r>
                             <w:r>
                               <w:rPr>
@@ -8198,7 +8198,7 @@
                           <w:sz w:val="20"/>
                           <w:szCs w:val="20"/>
                         </w:rPr>
-                        <w:t xml:space="preserve">{{base_bid_formatted}} – Gypsum Underlayment System as described above (material sales tax INCLUDED)</w:t>
+                        <w:t xml:space="preserve">{{base_bid_formatted}} – Gypsum Underlayment System as described above {{base_tax_phrase}}</w:t>
                       </w:r>
                       <w:r>
                         <w:rPr>

</xml_diff>

<commit_message>
fix(proposal): remove review highlights from the gyp template
The gyp template carried Kyle's review-marker highlights (88 yellow + 6 cyan)
on the Material Sales Tax / Kansas Remodel Tax lines and WORK scope items
("USG", "GC to provide 500 sf of Onsite Covered Sound Mat Storage…"). Those
are internal markers, not customer content, and were rendering in the delivered
proposal. Removed all <w:highlight> runs from the template (text preserved).
Per Hanz. Adds a regression test asserting no highlight markup in the generated
gyp doc.

Co-Authored-By: Claude Fable 5 <noreply@anthropic.com>
</commit_message>
<xml_diff>
--- a/backend/templates/Gyp/xx TREADWELL UNDERLAYMENT PROPOSAL - xx.docx
+++ b/backend/templates/Gyp/xx TREADWELL UNDERLAYMENT PROPOSAL - xx.docx
@@ -749,7 +749,6 @@
                                 <w:color w:val="404040" w:themeColor="text1" w:themeTint="BF"/>
                                 <w:sz w:val="18"/>
                                 <w:szCs w:val="18"/>
-                                <w:highlight w:val="yellow"/>
                                 <w:u w:val="single"/>
                               </w:rPr>
                               <w:t/>
@@ -821,7 +820,6 @@
                                 <w:color w:val="404040" w:themeColor="text1" w:themeTint="BF"/>
                                 <w:sz w:val="18"/>
                                 <w:szCs w:val="18"/>
-                                <w:highlight w:val="yellow"/>
                               </w:rPr>
                               <w:t/>
                             </w:r>
@@ -833,7 +831,6 @@
                                 <w:color w:val="404040" w:themeColor="text1" w:themeTint="BF"/>
                                 <w:sz w:val="18"/>
                                 <w:szCs w:val="18"/>
-                                <w:highlight w:val="yellow"/>
                                 <w:u w:val="single"/>
                               </w:rPr>
                               <w:t/>
@@ -846,7 +843,6 @@
                                 <w:color w:val="404040" w:themeColor="text1" w:themeTint="BF"/>
                                 <w:sz w:val="18"/>
                                 <w:szCs w:val="18"/>
-                                <w:highlight w:val="yellow"/>
                               </w:rPr>
                               <w:t/>
                             </w:r>
@@ -1031,7 +1027,6 @@
                                 <w:color w:val="404040" w:themeColor="text1" w:themeTint="BF"/>
                                 <w:sz w:val="18"/>
                                 <w:szCs w:val="18"/>
-                                <w:highlight w:val="yellow"/>
                               </w:rPr>
                               <w:t/>
                             </w:r>
@@ -1041,7 +1036,6 @@
                                 <w:color w:val="404040" w:themeColor="text1" w:themeTint="BF"/>
                                 <w:sz w:val="17"/>
                                 <w:szCs w:val="17"/>
-                                <w:highlight w:val="yellow"/>
                               </w:rPr>
                               <w:t xml:space="preserve"/>
                             </w:r>
@@ -1051,7 +1045,6 @@
                                 <w:color w:val="404040" w:themeColor="text1" w:themeTint="BF"/>
                                 <w:sz w:val="17"/>
                                 <w:szCs w:val="17"/>
-                                <w:highlight w:val="yellow"/>
                               </w:rPr>
                               <w:t xml:space="preserve"/>
                             </w:r>
@@ -1081,7 +1074,6 @@
                                 <w:color w:val="404040" w:themeColor="text1" w:themeTint="BF"/>
                                 <w:sz w:val="18"/>
                                 <w:szCs w:val="18"/>
-                                <w:highlight w:val="cyan"/>
                                 <w:u w:val="single"/>
                               </w:rPr>
                               <w:t/>
@@ -1392,7 +1384,6 @@
                                 <w:color w:val="404040" w:themeColor="text1" w:themeTint="BF"/>
                                 <w:sz w:val="18"/>
                                 <w:szCs w:val="18"/>
-                                <w:highlight w:val="yellow"/>
                               </w:rPr>
                               <w:t/>
                             </w:r>
@@ -1402,7 +1393,6 @@
                                 <w:color w:val="404040" w:themeColor="text1" w:themeTint="BF"/>
                                 <w:sz w:val="17"/>
                                 <w:szCs w:val="17"/>
-                                <w:highlight w:val="yellow"/>
                               </w:rPr>
                               <w:t xml:space="preserve"/>
                             </w:r>
@@ -1486,7 +1476,6 @@
                                 <w:color w:val="404040" w:themeColor="text1" w:themeTint="BF"/>
                                 <w:sz w:val="18"/>
                                 <w:szCs w:val="18"/>
-                                <w:highlight w:val="cyan"/>
                                 <w:u w:val="single"/>
                               </w:rPr>
                               <w:t/>
@@ -1541,7 +1530,6 @@
                                 <w:color w:val="404040" w:themeColor="text1" w:themeTint="BF"/>
                                 <w:sz w:val="17"/>
                                 <w:szCs w:val="17"/>
-                                <w:highlight w:val="yellow"/>
                                 <w:u w:val="single"/>
                               </w:rPr>
                               <w:t/>
@@ -1554,7 +1542,6 @@
                                 <w:color w:val="404040" w:themeColor="text1" w:themeTint="BF"/>
                                 <w:sz w:val="17"/>
                                 <w:szCs w:val="17"/>
-                                <w:highlight w:val="yellow"/>
                                 <w:u w:val="single"/>
                               </w:rPr>
                               <w:t/>
@@ -1567,7 +1554,6 @@
                                 <w:color w:val="404040" w:themeColor="text1" w:themeTint="BF"/>
                                 <w:sz w:val="16"/>
                                 <w:szCs w:val="16"/>
-                                <w:highlight w:val="yellow"/>
                                 <w:u w:val="single"/>
                               </w:rPr>
                               <w:t xml:space="preserve"/>
@@ -1578,7 +1564,6 @@
                                 <w:color w:val="404040" w:themeColor="text1" w:themeTint="BF"/>
                                 <w:sz w:val="16"/>
                                 <w:szCs w:val="16"/>
-                                <w:highlight w:val="yellow"/>
                                 <w:u w:val="single"/>
                               </w:rPr>
                               <w:t/>
@@ -1591,7 +1576,6 @@
                                 <w:color w:val="404040" w:themeColor="text1" w:themeTint="BF"/>
                                 <w:sz w:val="16"/>
                                 <w:szCs w:val="16"/>
-                                <w:highlight w:val="yellow"/>
                                 <w:u w:val="single"/>
                               </w:rPr>
                               <w:t xml:space="preserve"/>
@@ -1604,7 +1588,6 @@
                                 <w:color w:val="404040" w:themeColor="text1" w:themeTint="BF"/>
                                 <w:sz w:val="18"/>
                                 <w:szCs w:val="18"/>
-                                <w:highlight w:val="yellow"/>
                                 <w:u w:val="single"/>
                               </w:rPr>
                               <w:t/>
@@ -1615,7 +1598,6 @@
                                 <w:color w:val="404040" w:themeColor="text1" w:themeTint="BF"/>
                                 <w:sz w:val="16"/>
                                 <w:szCs w:val="16"/>
-                                <w:highlight w:val="yellow"/>
                                 <w:u w:val="single"/>
                               </w:rPr>
                               <w:t/>
@@ -1628,7 +1610,6 @@
                                 <w:color w:val="404040" w:themeColor="text1" w:themeTint="BF"/>
                                 <w:sz w:val="18"/>
                                 <w:szCs w:val="18"/>
-                                <w:highlight w:val="yellow"/>
                                 <w:u w:val="single"/>
                               </w:rPr>
                               <w:t/>
@@ -1674,7 +1655,6 @@
                                 <w:color w:val="404040" w:themeColor="text1" w:themeTint="BF"/>
                                 <w:sz w:val="18"/>
                                 <w:szCs w:val="18"/>
-                                <w:highlight w:val="yellow"/>
                               </w:rPr>
                               <w:t xml:space="preserve">USG </w:t>
                             </w:r>
@@ -1921,7 +1901,6 @@
                                 <w:color w:val="404040" w:themeColor="text1" w:themeTint="BF"/>
                                 <w:sz w:val="18"/>
                                 <w:szCs w:val="18"/>
-                                <w:highlight w:val="yellow"/>
                               </w:rPr>
                               <w:t/>
                             </w:r>
@@ -1931,7 +1910,6 @@
                                 <w:color w:val="404040" w:themeColor="text1" w:themeTint="BF"/>
                                 <w:sz w:val="17"/>
                                 <w:szCs w:val="17"/>
-                                <w:highlight w:val="yellow"/>
                               </w:rPr>
                               <w:t xml:space="preserve"/>
                             </w:r>
@@ -1979,7 +1957,6 @@
                                 <w:color w:val="404040" w:themeColor="text1" w:themeTint="BF"/>
                                 <w:sz w:val="18"/>
                                 <w:szCs w:val="18"/>
-                                <w:highlight w:val="cyan"/>
                                 <w:u w:val="single"/>
                               </w:rPr>
                               <w:t/>
@@ -3873,7 +3850,6 @@
                                 <w:color w:val="404040" w:themeColor="text1" w:themeTint="BF"/>
                                 <w:sz w:val="18"/>
                                 <w:szCs w:val="18"/>
-                                <w:highlight w:val="yellow"/>
                               </w:rPr>
                               <w:t>GC to provide 500</w:t>
                             </w:r>
@@ -3883,7 +3859,6 @@
                                 <w:color w:val="404040" w:themeColor="text1" w:themeTint="BF"/>
                                 <w:sz w:val="16"/>
                                 <w:szCs w:val="16"/>
-                                <w:highlight w:val="yellow"/>
                               </w:rPr>
                               <w:t xml:space="preserve"> sf of </w:t>
                             </w:r>
@@ -3893,7 +3868,6 @@
                                 <w:color w:val="404040" w:themeColor="text1" w:themeTint="BF"/>
                                 <w:sz w:val="18"/>
                                 <w:szCs w:val="18"/>
-                                <w:highlight w:val="yellow"/>
                               </w:rPr>
                               <w:t xml:space="preserve">Onsite Covered </w:t>
                             </w:r>
@@ -3903,7 +3877,6 @@
                                 <w:color w:val="404040" w:themeColor="text1" w:themeTint="BF"/>
                                 <w:sz w:val="18"/>
                                 <w:szCs w:val="18"/>
-                                <w:highlight w:val="yellow"/>
                               </w:rPr>
                               <w:t xml:space="preserve">Sound Mat </w:t>
                             </w:r>
@@ -3913,7 +3886,6 @@
                                 <w:color w:val="404040" w:themeColor="text1" w:themeTint="BF"/>
                                 <w:sz w:val="18"/>
                                 <w:szCs w:val="18"/>
-                                <w:highlight w:val="yellow"/>
                               </w:rPr>
                               <w:t>Storage</w:t>
                             </w:r>
@@ -3923,7 +3895,6 @@
                                 <w:color w:val="404040" w:themeColor="text1" w:themeTint="BF"/>
                                 <w:sz w:val="17"/>
                                 <w:szCs w:val="17"/>
-                                <w:highlight w:val="yellow"/>
                               </w:rPr>
                               <w:t xml:space="preserve">, </w:t>
                             </w:r>
@@ -3935,7 +3906,6 @@
                                 <w:color w:val="404040" w:themeColor="text1" w:themeTint="BF"/>
                                 <w:sz w:val="17"/>
                                 <w:szCs w:val="17"/>
-                                <w:highlight w:val="yellow"/>
                               </w:rPr>
                               <w:t>if applicable</w:t>
                             </w:r>
@@ -3945,7 +3915,6 @@
                                 <w:color w:val="404040" w:themeColor="text1" w:themeTint="BF"/>
                                 <w:sz w:val="18"/>
                                 <w:szCs w:val="18"/>
-                                <w:highlight w:val="yellow"/>
                               </w:rPr>
                               <w:t xml:space="preserve"> </w:t>
                             </w:r>
@@ -3957,7 +3926,6 @@
                                 <w:color w:val="404040" w:themeColor="text1" w:themeTint="BF"/>
                                 <w:sz w:val="18"/>
                                 <w:szCs w:val="18"/>
-                                <w:highlight w:val="yellow"/>
                               </w:rPr>
                               <w:t>(</w:t>
                             </w:r>
@@ -3969,7 +3937,6 @@
                                 <w:color w:val="404040" w:themeColor="text1" w:themeTint="BF"/>
                                 <w:sz w:val="16"/>
                                 <w:szCs w:val="16"/>
-                                <w:highlight w:val="yellow"/>
                               </w:rPr>
                               <w:t>see add if not available</w:t>
                             </w:r>
@@ -3981,7 +3948,6 @@
                                 <w:color w:val="404040" w:themeColor="text1" w:themeTint="BF"/>
                                 <w:sz w:val="18"/>
                                 <w:szCs w:val="18"/>
-                                <w:highlight w:val="yellow"/>
                               </w:rPr>
                               <w:t>)</w:t>
                             </w:r>
@@ -4109,7 +4075,6 @@
                           <w:color w:val="404040" w:themeColor="text1" w:themeTint="BF"/>
                           <w:sz w:val="18"/>
                           <w:szCs w:val="18"/>
-                          <w:highlight w:val="yellow"/>
                           <w:u w:val="single"/>
                         </w:rPr>
                         <w:t/>
@@ -4181,7 +4146,6 @@
                           <w:color w:val="404040" w:themeColor="text1" w:themeTint="BF"/>
                           <w:sz w:val="18"/>
                           <w:szCs w:val="18"/>
-                          <w:highlight w:val="yellow"/>
                         </w:rPr>
                         <w:t/>
                       </w:r>
@@ -4193,7 +4157,6 @@
                           <w:color w:val="404040" w:themeColor="text1" w:themeTint="BF"/>
                           <w:sz w:val="18"/>
                           <w:szCs w:val="18"/>
-                          <w:highlight w:val="yellow"/>
                           <w:u w:val="single"/>
                         </w:rPr>
                         <w:t/>
@@ -4206,7 +4169,6 @@
                           <w:color w:val="404040" w:themeColor="text1" w:themeTint="BF"/>
                           <w:sz w:val="18"/>
                           <w:szCs w:val="18"/>
-                          <w:highlight w:val="yellow"/>
                         </w:rPr>
                         <w:t/>
                       </w:r>
@@ -4391,7 +4353,6 @@
                           <w:color w:val="404040" w:themeColor="text1" w:themeTint="BF"/>
                           <w:sz w:val="18"/>
                           <w:szCs w:val="18"/>
-                          <w:highlight w:val="yellow"/>
                         </w:rPr>
                         <w:t/>
                       </w:r>
@@ -4401,7 +4362,6 @@
                           <w:color w:val="404040" w:themeColor="text1" w:themeTint="BF"/>
                           <w:sz w:val="17"/>
                           <w:szCs w:val="17"/>
-                          <w:highlight w:val="yellow"/>
                         </w:rPr>
                         <w:t xml:space="preserve"/>
                       </w:r>
@@ -4411,7 +4371,6 @@
                           <w:color w:val="404040" w:themeColor="text1" w:themeTint="BF"/>
                           <w:sz w:val="17"/>
                           <w:szCs w:val="17"/>
-                          <w:highlight w:val="yellow"/>
                         </w:rPr>
                         <w:t xml:space="preserve"/>
                       </w:r>
@@ -4441,7 +4400,6 @@
                           <w:color w:val="404040" w:themeColor="text1" w:themeTint="BF"/>
                           <w:sz w:val="18"/>
                           <w:szCs w:val="18"/>
-                          <w:highlight w:val="cyan"/>
                           <w:u w:val="single"/>
                         </w:rPr>
                         <w:t/>
@@ -4752,7 +4710,6 @@
                           <w:color w:val="404040" w:themeColor="text1" w:themeTint="BF"/>
                           <w:sz w:val="18"/>
                           <w:szCs w:val="18"/>
-                          <w:highlight w:val="yellow"/>
                         </w:rPr>
                         <w:t/>
                       </w:r>
@@ -4762,7 +4719,6 @@
                           <w:color w:val="404040" w:themeColor="text1" w:themeTint="BF"/>
                           <w:sz w:val="17"/>
                           <w:szCs w:val="17"/>
-                          <w:highlight w:val="yellow"/>
                         </w:rPr>
                         <w:t xml:space="preserve"/>
                       </w:r>
@@ -4846,7 +4802,6 @@
                           <w:color w:val="404040" w:themeColor="text1" w:themeTint="BF"/>
                           <w:sz w:val="18"/>
                           <w:szCs w:val="18"/>
-                          <w:highlight w:val="cyan"/>
                           <w:u w:val="single"/>
                         </w:rPr>
                         <w:t/>
@@ -4901,7 +4856,6 @@
                           <w:color w:val="404040" w:themeColor="text1" w:themeTint="BF"/>
                           <w:sz w:val="17"/>
                           <w:szCs w:val="17"/>
-                          <w:highlight w:val="yellow"/>
                           <w:u w:val="single"/>
                         </w:rPr>
                         <w:t/>
@@ -4914,7 +4868,6 @@
                           <w:color w:val="404040" w:themeColor="text1" w:themeTint="BF"/>
                           <w:sz w:val="17"/>
                           <w:szCs w:val="17"/>
-                          <w:highlight w:val="yellow"/>
                           <w:u w:val="single"/>
                         </w:rPr>
                         <w:t/>
@@ -4927,7 +4880,6 @@
                           <w:color w:val="404040" w:themeColor="text1" w:themeTint="BF"/>
                           <w:sz w:val="16"/>
                           <w:szCs w:val="16"/>
-                          <w:highlight w:val="yellow"/>
                           <w:u w:val="single"/>
                         </w:rPr>
                         <w:t xml:space="preserve"/>
@@ -4938,7 +4890,6 @@
                           <w:color w:val="404040" w:themeColor="text1" w:themeTint="BF"/>
                           <w:sz w:val="16"/>
                           <w:szCs w:val="16"/>
-                          <w:highlight w:val="yellow"/>
                           <w:u w:val="single"/>
                         </w:rPr>
                         <w:t/>
@@ -4951,7 +4902,6 @@
                           <w:color w:val="404040" w:themeColor="text1" w:themeTint="BF"/>
                           <w:sz w:val="16"/>
                           <w:szCs w:val="16"/>
-                          <w:highlight w:val="yellow"/>
                           <w:u w:val="single"/>
                         </w:rPr>
                         <w:t xml:space="preserve"/>
@@ -4964,7 +4914,6 @@
                           <w:color w:val="404040" w:themeColor="text1" w:themeTint="BF"/>
                           <w:sz w:val="18"/>
                           <w:szCs w:val="18"/>
-                          <w:highlight w:val="yellow"/>
                           <w:u w:val="single"/>
                         </w:rPr>
                         <w:t/>
@@ -4975,7 +4924,6 @@
                           <w:color w:val="404040" w:themeColor="text1" w:themeTint="BF"/>
                           <w:sz w:val="16"/>
                           <w:szCs w:val="16"/>
-                          <w:highlight w:val="yellow"/>
                           <w:u w:val="single"/>
                         </w:rPr>
                         <w:t/>
@@ -4988,7 +4936,6 @@
                           <w:color w:val="404040" w:themeColor="text1" w:themeTint="BF"/>
                           <w:sz w:val="18"/>
                           <w:szCs w:val="18"/>
-                          <w:highlight w:val="yellow"/>
                           <w:u w:val="single"/>
                         </w:rPr>
                         <w:t/>
@@ -5034,7 +4981,6 @@
                           <w:color w:val="404040" w:themeColor="text1" w:themeTint="BF"/>
                           <w:sz w:val="18"/>
                           <w:szCs w:val="18"/>
-                          <w:highlight w:val="yellow"/>
                         </w:rPr>
                         <w:t xml:space="preserve">USG </w:t>
                       </w:r>
@@ -5281,7 +5227,6 @@
                           <w:color w:val="404040" w:themeColor="text1" w:themeTint="BF"/>
                           <w:sz w:val="18"/>
                           <w:szCs w:val="18"/>
-                          <w:highlight w:val="yellow"/>
                         </w:rPr>
                         <w:t/>
                       </w:r>
@@ -5291,7 +5236,6 @@
                           <w:color w:val="404040" w:themeColor="text1" w:themeTint="BF"/>
                           <w:sz w:val="17"/>
                           <w:szCs w:val="17"/>
-                          <w:highlight w:val="yellow"/>
                         </w:rPr>
                         <w:t xml:space="preserve"/>
                       </w:r>
@@ -5339,7 +5283,6 @@
                           <w:color w:val="404040" w:themeColor="text1" w:themeTint="BF"/>
                           <w:sz w:val="18"/>
                           <w:szCs w:val="18"/>
-                          <w:highlight w:val="cyan"/>
                           <w:u w:val="single"/>
                         </w:rPr>
                         <w:t/>
@@ -7233,7 +7176,6 @@
                           <w:color w:val="404040" w:themeColor="text1" w:themeTint="BF"/>
                           <w:sz w:val="18"/>
                           <w:szCs w:val="18"/>
-                          <w:highlight w:val="yellow"/>
                         </w:rPr>
                         <w:t>GC to provide 500</w:t>
                       </w:r>
@@ -7243,7 +7185,6 @@
                           <w:color w:val="404040" w:themeColor="text1" w:themeTint="BF"/>
                           <w:sz w:val="16"/>
                           <w:szCs w:val="16"/>
-                          <w:highlight w:val="yellow"/>
                         </w:rPr>
                         <w:t xml:space="preserve"> sf of </w:t>
                       </w:r>
@@ -7253,7 +7194,6 @@
                           <w:color w:val="404040" w:themeColor="text1" w:themeTint="BF"/>
                           <w:sz w:val="18"/>
                           <w:szCs w:val="18"/>
-                          <w:highlight w:val="yellow"/>
                         </w:rPr>
                         <w:t xml:space="preserve">Onsite Covered </w:t>
                       </w:r>
@@ -7263,7 +7203,6 @@
                           <w:color w:val="404040" w:themeColor="text1" w:themeTint="BF"/>
                           <w:sz w:val="18"/>
                           <w:szCs w:val="18"/>
-                          <w:highlight w:val="yellow"/>
                         </w:rPr>
                         <w:t xml:space="preserve">Sound Mat </w:t>
                       </w:r>
@@ -7273,7 +7212,6 @@
                           <w:color w:val="404040" w:themeColor="text1" w:themeTint="BF"/>
                           <w:sz w:val="18"/>
                           <w:szCs w:val="18"/>
-                          <w:highlight w:val="yellow"/>
                         </w:rPr>
                         <w:t>Storage</w:t>
                       </w:r>
@@ -7283,7 +7221,6 @@
                           <w:color w:val="404040" w:themeColor="text1" w:themeTint="BF"/>
                           <w:sz w:val="17"/>
                           <w:szCs w:val="17"/>
-                          <w:highlight w:val="yellow"/>
                         </w:rPr>
                         <w:t xml:space="preserve">, </w:t>
                       </w:r>
@@ -7295,7 +7232,6 @@
                           <w:color w:val="404040" w:themeColor="text1" w:themeTint="BF"/>
                           <w:sz w:val="17"/>
                           <w:szCs w:val="17"/>
-                          <w:highlight w:val="yellow"/>
                         </w:rPr>
                         <w:t>if applicable</w:t>
                       </w:r>
@@ -7305,7 +7241,6 @@
                           <w:color w:val="404040" w:themeColor="text1" w:themeTint="BF"/>
                           <w:sz w:val="18"/>
                           <w:szCs w:val="18"/>
-                          <w:highlight w:val="yellow"/>
                         </w:rPr>
                         <w:t xml:space="preserve"> </w:t>
                       </w:r>
@@ -7317,7 +7252,6 @@
                           <w:color w:val="404040" w:themeColor="text1" w:themeTint="BF"/>
                           <w:sz w:val="18"/>
                           <w:szCs w:val="18"/>
-                          <w:highlight w:val="yellow"/>
                         </w:rPr>
                         <w:t>(</w:t>
                       </w:r>
@@ -7329,7 +7263,6 @@
                           <w:color w:val="404040" w:themeColor="text1" w:themeTint="BF"/>
                           <w:sz w:val="16"/>
                           <w:szCs w:val="16"/>
-                          <w:highlight w:val="yellow"/>
                         </w:rPr>
                         <w:t>see add if not available</w:t>
                       </w:r>
@@ -7341,7 +7274,6 @@
                           <w:color w:val="404040" w:themeColor="text1" w:themeTint="BF"/>
                           <w:sz w:val="18"/>
                           <w:szCs w:val="18"/>
-                          <w:highlight w:val="yellow"/>
                         </w:rPr>
                         <w:t>)</w:t>
                       </w:r>
@@ -7613,7 +7545,6 @@
                                 <w:color w:val="404040" w:themeColor="text1" w:themeTint="BF"/>
                                 <w:sz w:val="18"/>
                                 <w:szCs w:val="18"/>
-                                <w:highlight w:val="yellow"/>
                                 <w:u w:val="single"/>
                               </w:rPr>
                               <w:t/>
@@ -7626,7 +7557,6 @@
                                 <w:color w:val="404040" w:themeColor="text1" w:themeTint="BF"/>
                                 <w:sz w:val="18"/>
                                 <w:szCs w:val="18"/>
-                                <w:highlight w:val="yellow"/>
                               </w:rPr>
                               <w:t/>
                             </w:r>
@@ -7663,7 +7593,6 @@
                                 <w:color w:val="404040" w:themeColor="text1" w:themeTint="BF"/>
                                 <w:sz w:val="18"/>
                                 <w:szCs w:val="18"/>
-                                <w:highlight w:val="yellow"/>
                               </w:rPr>
                               <w:t xml:space="preserve">{{material_tax_formatted}} – Material Sales Tax</w:t>
                             </w:r>
@@ -7673,7 +7602,6 @@
                                 <w:color w:val="404040" w:themeColor="text1" w:themeTint="BF"/>
                                 <w:sz w:val="18"/>
                                 <w:szCs w:val="18"/>
-                                <w:highlight w:val="yellow"/>
                               </w:rPr>
                               <w:t xml:space="preserve"/>
                             </w:r>
@@ -7683,7 +7611,6 @@
                                 <w:color w:val="404040" w:themeColor="text1" w:themeTint="BF"/>
                                 <w:sz w:val="18"/>
                                 <w:szCs w:val="18"/>
-                                <w:highlight w:val="yellow"/>
                               </w:rPr>
                               <w:t/>
                             </w:r>
@@ -7693,7 +7620,6 @@
                                 <w:color w:val="404040" w:themeColor="text1" w:themeTint="BF"/>
                                 <w:sz w:val="18"/>
                                 <w:szCs w:val="18"/>
-                                <w:highlight w:val="yellow"/>
                               </w:rPr>
                               <w:t xml:space="preserve"/>
                             </w:r>
@@ -7703,7 +7629,6 @@
                                 <w:color w:val="404040" w:themeColor="text1" w:themeTint="BF"/>
                                 <w:sz w:val="18"/>
                                 <w:szCs w:val="18"/>
-                                <w:highlight w:val="yellow"/>
                               </w:rPr>
                               <w:t/>
                             </w:r>
@@ -7713,7 +7638,6 @@
                                 <w:color w:val="404040" w:themeColor="text1" w:themeTint="BF"/>
                                 <w:sz w:val="18"/>
                                 <w:szCs w:val="18"/>
-                                <w:highlight w:val="yellow"/>
                               </w:rPr>
                               <w:t/>
                             </w:r>
@@ -7723,7 +7647,6 @@
                                 <w:color w:val="404040" w:themeColor="text1" w:themeTint="BF"/>
                                 <w:sz w:val="18"/>
                                 <w:szCs w:val="18"/>
-                                <w:highlight w:val="yellow"/>
                               </w:rPr>
                               <w:t/>
                             </w:r>
@@ -7758,7 +7681,6 @@
                                 <w:color w:val="404040" w:themeColor="text1" w:themeTint="BF"/>
                                 <w:sz w:val="18"/>
                                 <w:szCs w:val="18"/>
-                                <w:highlight w:val="yellow"/>
                                 <w:u w:val="single"/>
                               </w:rPr>
                               <w:t xml:space="preserve">{{tax_amount_formatted}} – Kansas Remodel Tax</w:t>
@@ -7769,7 +7691,6 @@
                                 <w:color w:val="404040" w:themeColor="text1" w:themeTint="BF"/>
                                 <w:sz w:val="18"/>
                                 <w:szCs w:val="18"/>
-                                <w:highlight w:val="yellow"/>
                                 <w:u w:val="single"/>
                               </w:rPr>
                               <w:t xml:space="preserve"/>
@@ -7780,7 +7701,6 @@
                                 <w:color w:val="404040" w:themeColor="text1" w:themeTint="BF"/>
                                 <w:sz w:val="18"/>
                                 <w:szCs w:val="18"/>
-                                <w:highlight w:val="yellow"/>
                                 <w:u w:val="single"/>
                               </w:rPr>
                               <w:t xml:space="preserve"/>
@@ -7791,7 +7711,6 @@
                                 <w:color w:val="404040" w:themeColor="text1" w:themeTint="BF"/>
                                 <w:sz w:val="18"/>
                                 <w:szCs w:val="18"/>
-                                <w:highlight w:val="yellow"/>
                               </w:rPr>
                               <w:t/>
                             </w:r>
@@ -8286,7 +8205,6 @@
                           <w:color w:val="404040" w:themeColor="text1" w:themeTint="BF"/>
                           <w:sz w:val="18"/>
                           <w:szCs w:val="18"/>
-                          <w:highlight w:val="yellow"/>
                           <w:u w:val="single"/>
                         </w:rPr>
                         <w:t/>
@@ -8299,7 +8217,6 @@
                           <w:color w:val="404040" w:themeColor="text1" w:themeTint="BF"/>
                           <w:sz w:val="18"/>
                           <w:szCs w:val="18"/>
-                          <w:highlight w:val="yellow"/>
                         </w:rPr>
                         <w:t/>
                       </w:r>
@@ -8336,7 +8253,6 @@
                           <w:color w:val="404040" w:themeColor="text1" w:themeTint="BF"/>
                           <w:sz w:val="18"/>
                           <w:szCs w:val="18"/>
-                          <w:highlight w:val="yellow"/>
                         </w:rPr>
                         <w:t xml:space="preserve">{{material_tax_formatted}} – Material Sales Tax</w:t>
                       </w:r>
@@ -8346,7 +8262,6 @@
                           <w:color w:val="404040" w:themeColor="text1" w:themeTint="BF"/>
                           <w:sz w:val="18"/>
                           <w:szCs w:val="18"/>
-                          <w:highlight w:val="yellow"/>
                         </w:rPr>
                         <w:t xml:space="preserve"/>
                       </w:r>
@@ -8356,7 +8271,6 @@
                           <w:color w:val="404040" w:themeColor="text1" w:themeTint="BF"/>
                           <w:sz w:val="18"/>
                           <w:szCs w:val="18"/>
-                          <w:highlight w:val="yellow"/>
                         </w:rPr>
                         <w:t/>
                       </w:r>
@@ -8366,7 +8280,6 @@
                           <w:color w:val="404040" w:themeColor="text1" w:themeTint="BF"/>
                           <w:sz w:val="18"/>
                           <w:szCs w:val="18"/>
-                          <w:highlight w:val="yellow"/>
                         </w:rPr>
                         <w:t xml:space="preserve"/>
                       </w:r>
@@ -8376,7 +8289,6 @@
                           <w:color w:val="404040" w:themeColor="text1" w:themeTint="BF"/>
                           <w:sz w:val="18"/>
                           <w:szCs w:val="18"/>
-                          <w:highlight w:val="yellow"/>
                         </w:rPr>
                         <w:t/>
                       </w:r>
@@ -8386,7 +8298,6 @@
                           <w:color w:val="404040" w:themeColor="text1" w:themeTint="BF"/>
                           <w:sz w:val="18"/>
                           <w:szCs w:val="18"/>
-                          <w:highlight w:val="yellow"/>
                         </w:rPr>
                         <w:t/>
                       </w:r>
@@ -8396,7 +8307,6 @@
                           <w:color w:val="404040" w:themeColor="text1" w:themeTint="BF"/>
                           <w:sz w:val="18"/>
                           <w:szCs w:val="18"/>
-                          <w:highlight w:val="yellow"/>
                         </w:rPr>
                         <w:t/>
                       </w:r>
@@ -8431,7 +8341,6 @@
                           <w:color w:val="404040" w:themeColor="text1" w:themeTint="BF"/>
                           <w:sz w:val="18"/>
                           <w:szCs w:val="18"/>
-                          <w:highlight w:val="yellow"/>
                           <w:u w:val="single"/>
                         </w:rPr>
                         <w:t xml:space="preserve">{{tax_amount_formatted}} – Kansas Remodel Tax</w:t>
@@ -8442,7 +8351,6 @@
                           <w:color w:val="404040" w:themeColor="text1" w:themeTint="BF"/>
                           <w:sz w:val="18"/>
                           <w:szCs w:val="18"/>
-                          <w:highlight w:val="yellow"/>
                           <w:u w:val="single"/>
                         </w:rPr>
                         <w:t xml:space="preserve"/>
@@ -8453,7 +8361,6 @@
                           <w:color w:val="404040" w:themeColor="text1" w:themeTint="BF"/>
                           <w:sz w:val="18"/>
                           <w:szCs w:val="18"/>
-                          <w:highlight w:val="yellow"/>
                           <w:u w:val="single"/>
                         </w:rPr>
                         <w:t xml:space="preserve"/>
@@ -8464,7 +8371,6 @@
                           <w:color w:val="404040" w:themeColor="text1" w:themeTint="BF"/>
                           <w:sz w:val="18"/>
                           <w:szCs w:val="18"/>
-                          <w:highlight w:val="yellow"/>
                         </w:rPr>
                         <w:t/>
                       </w:r>

</xml_diff>

<commit_message>
fix(proposal): remove review highlights from the gyp template (#151)
The gyp template carried Kyle's review-marker highlights (88 yellow + 6 cyan)
on the Material Sales Tax / Kansas Remodel Tax lines and WORK scope items
("USG", "GC to provide 500 sf of Onsite Covered Sound Mat Storage…"). Those
are internal markers, not customer content, and were rendering in the delivered
proposal. Removed all <w:highlight> runs from the template (text preserved).
Per Hanz. Adds a regression test asserting no highlight markup in the generated
gyp doc.

Co-authored-by: internz2026-sys <internz.2026@gmail.com>
Co-authored-by: Claude Fable 5 <noreply@anthropic.com>
</commit_message>
<xml_diff>
--- a/backend/templates/Gyp/xx TREADWELL UNDERLAYMENT PROPOSAL - xx.docx
+++ b/backend/templates/Gyp/xx TREADWELL UNDERLAYMENT PROPOSAL - xx.docx
@@ -749,7 +749,6 @@
                                 <w:color w:val="404040" w:themeColor="text1" w:themeTint="BF"/>
                                 <w:sz w:val="18"/>
                                 <w:szCs w:val="18"/>
-                                <w:highlight w:val="yellow"/>
                                 <w:u w:val="single"/>
                               </w:rPr>
                               <w:t/>
@@ -821,7 +820,6 @@
                                 <w:color w:val="404040" w:themeColor="text1" w:themeTint="BF"/>
                                 <w:sz w:val="18"/>
                                 <w:szCs w:val="18"/>
-                                <w:highlight w:val="yellow"/>
                               </w:rPr>
                               <w:t/>
                             </w:r>
@@ -833,7 +831,6 @@
                                 <w:color w:val="404040" w:themeColor="text1" w:themeTint="BF"/>
                                 <w:sz w:val="18"/>
                                 <w:szCs w:val="18"/>
-                                <w:highlight w:val="yellow"/>
                                 <w:u w:val="single"/>
                               </w:rPr>
                               <w:t/>
@@ -846,7 +843,6 @@
                                 <w:color w:val="404040" w:themeColor="text1" w:themeTint="BF"/>
                                 <w:sz w:val="18"/>
                                 <w:szCs w:val="18"/>
-                                <w:highlight w:val="yellow"/>
                               </w:rPr>
                               <w:t/>
                             </w:r>
@@ -1031,7 +1027,6 @@
                                 <w:color w:val="404040" w:themeColor="text1" w:themeTint="BF"/>
                                 <w:sz w:val="18"/>
                                 <w:szCs w:val="18"/>
-                                <w:highlight w:val="yellow"/>
                               </w:rPr>
                               <w:t/>
                             </w:r>
@@ -1041,7 +1036,6 @@
                                 <w:color w:val="404040" w:themeColor="text1" w:themeTint="BF"/>
                                 <w:sz w:val="17"/>
                                 <w:szCs w:val="17"/>
-                                <w:highlight w:val="yellow"/>
                               </w:rPr>
                               <w:t xml:space="preserve"/>
                             </w:r>
@@ -1051,7 +1045,6 @@
                                 <w:color w:val="404040" w:themeColor="text1" w:themeTint="BF"/>
                                 <w:sz w:val="17"/>
                                 <w:szCs w:val="17"/>
-                                <w:highlight w:val="yellow"/>
                               </w:rPr>
                               <w:t xml:space="preserve"/>
                             </w:r>
@@ -1081,7 +1074,6 @@
                                 <w:color w:val="404040" w:themeColor="text1" w:themeTint="BF"/>
                                 <w:sz w:val="18"/>
                                 <w:szCs w:val="18"/>
-                                <w:highlight w:val="cyan"/>
                                 <w:u w:val="single"/>
                               </w:rPr>
                               <w:t/>
@@ -1392,7 +1384,6 @@
                                 <w:color w:val="404040" w:themeColor="text1" w:themeTint="BF"/>
                                 <w:sz w:val="18"/>
                                 <w:szCs w:val="18"/>
-                                <w:highlight w:val="yellow"/>
                               </w:rPr>
                               <w:t/>
                             </w:r>
@@ -1402,7 +1393,6 @@
                                 <w:color w:val="404040" w:themeColor="text1" w:themeTint="BF"/>
                                 <w:sz w:val="17"/>
                                 <w:szCs w:val="17"/>
-                                <w:highlight w:val="yellow"/>
                               </w:rPr>
                               <w:t xml:space="preserve"/>
                             </w:r>
@@ -1486,7 +1476,6 @@
                                 <w:color w:val="404040" w:themeColor="text1" w:themeTint="BF"/>
                                 <w:sz w:val="18"/>
                                 <w:szCs w:val="18"/>
-                                <w:highlight w:val="cyan"/>
                                 <w:u w:val="single"/>
                               </w:rPr>
                               <w:t/>
@@ -1541,7 +1530,6 @@
                                 <w:color w:val="404040" w:themeColor="text1" w:themeTint="BF"/>
                                 <w:sz w:val="17"/>
                                 <w:szCs w:val="17"/>
-                                <w:highlight w:val="yellow"/>
                                 <w:u w:val="single"/>
                               </w:rPr>
                               <w:t/>
@@ -1554,7 +1542,6 @@
                                 <w:color w:val="404040" w:themeColor="text1" w:themeTint="BF"/>
                                 <w:sz w:val="17"/>
                                 <w:szCs w:val="17"/>
-                                <w:highlight w:val="yellow"/>
                                 <w:u w:val="single"/>
                               </w:rPr>
                               <w:t/>
@@ -1567,7 +1554,6 @@
                                 <w:color w:val="404040" w:themeColor="text1" w:themeTint="BF"/>
                                 <w:sz w:val="16"/>
                                 <w:szCs w:val="16"/>
-                                <w:highlight w:val="yellow"/>
                                 <w:u w:val="single"/>
                               </w:rPr>
                               <w:t xml:space="preserve"/>
@@ -1578,7 +1564,6 @@
                                 <w:color w:val="404040" w:themeColor="text1" w:themeTint="BF"/>
                                 <w:sz w:val="16"/>
                                 <w:szCs w:val="16"/>
-                                <w:highlight w:val="yellow"/>
                                 <w:u w:val="single"/>
                               </w:rPr>
                               <w:t/>
@@ -1591,7 +1576,6 @@
                                 <w:color w:val="404040" w:themeColor="text1" w:themeTint="BF"/>
                                 <w:sz w:val="16"/>
                                 <w:szCs w:val="16"/>
-                                <w:highlight w:val="yellow"/>
                                 <w:u w:val="single"/>
                               </w:rPr>
                               <w:t xml:space="preserve"/>
@@ -1604,7 +1588,6 @@
                                 <w:color w:val="404040" w:themeColor="text1" w:themeTint="BF"/>
                                 <w:sz w:val="18"/>
                                 <w:szCs w:val="18"/>
-                                <w:highlight w:val="yellow"/>
                                 <w:u w:val="single"/>
                               </w:rPr>
                               <w:t/>
@@ -1615,7 +1598,6 @@
                                 <w:color w:val="404040" w:themeColor="text1" w:themeTint="BF"/>
                                 <w:sz w:val="16"/>
                                 <w:szCs w:val="16"/>
-                                <w:highlight w:val="yellow"/>
                                 <w:u w:val="single"/>
                               </w:rPr>
                               <w:t/>
@@ -1628,7 +1610,6 @@
                                 <w:color w:val="404040" w:themeColor="text1" w:themeTint="BF"/>
                                 <w:sz w:val="18"/>
                                 <w:szCs w:val="18"/>
-                                <w:highlight w:val="yellow"/>
                                 <w:u w:val="single"/>
                               </w:rPr>
                               <w:t/>
@@ -1674,7 +1655,6 @@
                                 <w:color w:val="404040" w:themeColor="text1" w:themeTint="BF"/>
                                 <w:sz w:val="18"/>
                                 <w:szCs w:val="18"/>
-                                <w:highlight w:val="yellow"/>
                               </w:rPr>
                               <w:t xml:space="preserve">USG </w:t>
                             </w:r>
@@ -1921,7 +1901,6 @@
                                 <w:color w:val="404040" w:themeColor="text1" w:themeTint="BF"/>
                                 <w:sz w:val="18"/>
                                 <w:szCs w:val="18"/>
-                                <w:highlight w:val="yellow"/>
                               </w:rPr>
                               <w:t/>
                             </w:r>
@@ -1931,7 +1910,6 @@
                                 <w:color w:val="404040" w:themeColor="text1" w:themeTint="BF"/>
                                 <w:sz w:val="17"/>
                                 <w:szCs w:val="17"/>
-                                <w:highlight w:val="yellow"/>
                               </w:rPr>
                               <w:t xml:space="preserve"/>
                             </w:r>
@@ -1979,7 +1957,6 @@
                                 <w:color w:val="404040" w:themeColor="text1" w:themeTint="BF"/>
                                 <w:sz w:val="18"/>
                                 <w:szCs w:val="18"/>
-                                <w:highlight w:val="cyan"/>
                                 <w:u w:val="single"/>
                               </w:rPr>
                               <w:t/>
@@ -3873,7 +3850,6 @@
                                 <w:color w:val="404040" w:themeColor="text1" w:themeTint="BF"/>
                                 <w:sz w:val="18"/>
                                 <w:szCs w:val="18"/>
-                                <w:highlight w:val="yellow"/>
                               </w:rPr>
                               <w:t>GC to provide 500</w:t>
                             </w:r>
@@ -3883,7 +3859,6 @@
                                 <w:color w:val="404040" w:themeColor="text1" w:themeTint="BF"/>
                                 <w:sz w:val="16"/>
                                 <w:szCs w:val="16"/>
-                                <w:highlight w:val="yellow"/>
                               </w:rPr>
                               <w:t xml:space="preserve"> sf of </w:t>
                             </w:r>
@@ -3893,7 +3868,6 @@
                                 <w:color w:val="404040" w:themeColor="text1" w:themeTint="BF"/>
                                 <w:sz w:val="18"/>
                                 <w:szCs w:val="18"/>
-                                <w:highlight w:val="yellow"/>
                               </w:rPr>
                               <w:t xml:space="preserve">Onsite Covered </w:t>
                             </w:r>
@@ -3903,7 +3877,6 @@
                                 <w:color w:val="404040" w:themeColor="text1" w:themeTint="BF"/>
                                 <w:sz w:val="18"/>
                                 <w:szCs w:val="18"/>
-                                <w:highlight w:val="yellow"/>
                               </w:rPr>
                               <w:t xml:space="preserve">Sound Mat </w:t>
                             </w:r>
@@ -3913,7 +3886,6 @@
                                 <w:color w:val="404040" w:themeColor="text1" w:themeTint="BF"/>
                                 <w:sz w:val="18"/>
                                 <w:szCs w:val="18"/>
-                                <w:highlight w:val="yellow"/>
                               </w:rPr>
                               <w:t>Storage</w:t>
                             </w:r>
@@ -3923,7 +3895,6 @@
                                 <w:color w:val="404040" w:themeColor="text1" w:themeTint="BF"/>
                                 <w:sz w:val="17"/>
                                 <w:szCs w:val="17"/>
-                                <w:highlight w:val="yellow"/>
                               </w:rPr>
                               <w:t xml:space="preserve">, </w:t>
                             </w:r>
@@ -3935,7 +3906,6 @@
                                 <w:color w:val="404040" w:themeColor="text1" w:themeTint="BF"/>
                                 <w:sz w:val="17"/>
                                 <w:szCs w:val="17"/>
-                                <w:highlight w:val="yellow"/>
                               </w:rPr>
                               <w:t>if applicable</w:t>
                             </w:r>
@@ -3945,7 +3915,6 @@
                                 <w:color w:val="404040" w:themeColor="text1" w:themeTint="BF"/>
                                 <w:sz w:val="18"/>
                                 <w:szCs w:val="18"/>
-                                <w:highlight w:val="yellow"/>
                               </w:rPr>
                               <w:t xml:space="preserve"> </w:t>
                             </w:r>
@@ -3957,7 +3926,6 @@
                                 <w:color w:val="404040" w:themeColor="text1" w:themeTint="BF"/>
                                 <w:sz w:val="18"/>
                                 <w:szCs w:val="18"/>
-                                <w:highlight w:val="yellow"/>
                               </w:rPr>
                               <w:t>(</w:t>
                             </w:r>
@@ -3969,7 +3937,6 @@
                                 <w:color w:val="404040" w:themeColor="text1" w:themeTint="BF"/>
                                 <w:sz w:val="16"/>
                                 <w:szCs w:val="16"/>
-                                <w:highlight w:val="yellow"/>
                               </w:rPr>
                               <w:t>see add if not available</w:t>
                             </w:r>
@@ -3981,7 +3948,6 @@
                                 <w:color w:val="404040" w:themeColor="text1" w:themeTint="BF"/>
                                 <w:sz w:val="18"/>
                                 <w:szCs w:val="18"/>
-                                <w:highlight w:val="yellow"/>
                               </w:rPr>
                               <w:t>)</w:t>
                             </w:r>
@@ -4109,7 +4075,6 @@
                           <w:color w:val="404040" w:themeColor="text1" w:themeTint="BF"/>
                           <w:sz w:val="18"/>
                           <w:szCs w:val="18"/>
-                          <w:highlight w:val="yellow"/>
                           <w:u w:val="single"/>
                         </w:rPr>
                         <w:t/>
@@ -4181,7 +4146,6 @@
                           <w:color w:val="404040" w:themeColor="text1" w:themeTint="BF"/>
                           <w:sz w:val="18"/>
                           <w:szCs w:val="18"/>
-                          <w:highlight w:val="yellow"/>
                         </w:rPr>
                         <w:t/>
                       </w:r>
@@ -4193,7 +4157,6 @@
                           <w:color w:val="404040" w:themeColor="text1" w:themeTint="BF"/>
                           <w:sz w:val="18"/>
                           <w:szCs w:val="18"/>
-                          <w:highlight w:val="yellow"/>
                           <w:u w:val="single"/>
                         </w:rPr>
                         <w:t/>
@@ -4206,7 +4169,6 @@
                           <w:color w:val="404040" w:themeColor="text1" w:themeTint="BF"/>
                           <w:sz w:val="18"/>
                           <w:szCs w:val="18"/>
-                          <w:highlight w:val="yellow"/>
                         </w:rPr>
                         <w:t/>
                       </w:r>
@@ -4391,7 +4353,6 @@
                           <w:color w:val="404040" w:themeColor="text1" w:themeTint="BF"/>
                           <w:sz w:val="18"/>
                           <w:szCs w:val="18"/>
-                          <w:highlight w:val="yellow"/>
                         </w:rPr>
                         <w:t/>
                       </w:r>
@@ -4401,7 +4362,6 @@
                           <w:color w:val="404040" w:themeColor="text1" w:themeTint="BF"/>
                           <w:sz w:val="17"/>
                           <w:szCs w:val="17"/>
-                          <w:highlight w:val="yellow"/>
                         </w:rPr>
                         <w:t xml:space="preserve"/>
                       </w:r>
@@ -4411,7 +4371,6 @@
                           <w:color w:val="404040" w:themeColor="text1" w:themeTint="BF"/>
                           <w:sz w:val="17"/>
                           <w:szCs w:val="17"/>
-                          <w:highlight w:val="yellow"/>
                         </w:rPr>
                         <w:t xml:space="preserve"/>
                       </w:r>
@@ -4441,7 +4400,6 @@
                           <w:color w:val="404040" w:themeColor="text1" w:themeTint="BF"/>
                           <w:sz w:val="18"/>
                           <w:szCs w:val="18"/>
-                          <w:highlight w:val="cyan"/>
                           <w:u w:val="single"/>
                         </w:rPr>
                         <w:t/>
@@ -4752,7 +4710,6 @@
                           <w:color w:val="404040" w:themeColor="text1" w:themeTint="BF"/>
                           <w:sz w:val="18"/>
                           <w:szCs w:val="18"/>
-                          <w:highlight w:val="yellow"/>
                         </w:rPr>
                         <w:t/>
                       </w:r>
@@ -4762,7 +4719,6 @@
                           <w:color w:val="404040" w:themeColor="text1" w:themeTint="BF"/>
                           <w:sz w:val="17"/>
                           <w:szCs w:val="17"/>
-                          <w:highlight w:val="yellow"/>
                         </w:rPr>
                         <w:t xml:space="preserve"/>
                       </w:r>
@@ -4846,7 +4802,6 @@
                           <w:color w:val="404040" w:themeColor="text1" w:themeTint="BF"/>
                           <w:sz w:val="18"/>
                           <w:szCs w:val="18"/>
-                          <w:highlight w:val="cyan"/>
                           <w:u w:val="single"/>
                         </w:rPr>
                         <w:t/>
@@ -4901,7 +4856,6 @@
                           <w:color w:val="404040" w:themeColor="text1" w:themeTint="BF"/>
                           <w:sz w:val="17"/>
                           <w:szCs w:val="17"/>
-                          <w:highlight w:val="yellow"/>
                           <w:u w:val="single"/>
                         </w:rPr>
                         <w:t/>
@@ -4914,7 +4868,6 @@
                           <w:color w:val="404040" w:themeColor="text1" w:themeTint="BF"/>
                           <w:sz w:val="17"/>
                           <w:szCs w:val="17"/>
-                          <w:highlight w:val="yellow"/>
                           <w:u w:val="single"/>
                         </w:rPr>
                         <w:t/>
@@ -4927,7 +4880,6 @@
                           <w:color w:val="404040" w:themeColor="text1" w:themeTint="BF"/>
                           <w:sz w:val="16"/>
                           <w:szCs w:val="16"/>
-                          <w:highlight w:val="yellow"/>
                           <w:u w:val="single"/>
                         </w:rPr>
                         <w:t xml:space="preserve"/>
@@ -4938,7 +4890,6 @@
                           <w:color w:val="404040" w:themeColor="text1" w:themeTint="BF"/>
                           <w:sz w:val="16"/>
                           <w:szCs w:val="16"/>
-                          <w:highlight w:val="yellow"/>
                           <w:u w:val="single"/>
                         </w:rPr>
                         <w:t/>
@@ -4951,7 +4902,6 @@
                           <w:color w:val="404040" w:themeColor="text1" w:themeTint="BF"/>
                           <w:sz w:val="16"/>
                           <w:szCs w:val="16"/>
-                          <w:highlight w:val="yellow"/>
                           <w:u w:val="single"/>
                         </w:rPr>
                         <w:t xml:space="preserve"/>
@@ -4964,7 +4914,6 @@
                           <w:color w:val="404040" w:themeColor="text1" w:themeTint="BF"/>
                           <w:sz w:val="18"/>
                           <w:szCs w:val="18"/>
-                          <w:highlight w:val="yellow"/>
                           <w:u w:val="single"/>
                         </w:rPr>
                         <w:t/>
@@ -4975,7 +4924,6 @@
                           <w:color w:val="404040" w:themeColor="text1" w:themeTint="BF"/>
                           <w:sz w:val="16"/>
                           <w:szCs w:val="16"/>
-                          <w:highlight w:val="yellow"/>
                           <w:u w:val="single"/>
                         </w:rPr>
                         <w:t/>
@@ -4988,7 +4936,6 @@
                           <w:color w:val="404040" w:themeColor="text1" w:themeTint="BF"/>
                           <w:sz w:val="18"/>
                           <w:szCs w:val="18"/>
-                          <w:highlight w:val="yellow"/>
                           <w:u w:val="single"/>
                         </w:rPr>
                         <w:t/>
@@ -5034,7 +4981,6 @@
                           <w:color w:val="404040" w:themeColor="text1" w:themeTint="BF"/>
                           <w:sz w:val="18"/>
                           <w:szCs w:val="18"/>
-                          <w:highlight w:val="yellow"/>
                         </w:rPr>
                         <w:t xml:space="preserve">USG </w:t>
                       </w:r>
@@ -5281,7 +5227,6 @@
                           <w:color w:val="404040" w:themeColor="text1" w:themeTint="BF"/>
                           <w:sz w:val="18"/>
                           <w:szCs w:val="18"/>
-                          <w:highlight w:val="yellow"/>
                         </w:rPr>
                         <w:t/>
                       </w:r>
@@ -5291,7 +5236,6 @@
                           <w:color w:val="404040" w:themeColor="text1" w:themeTint="BF"/>
                           <w:sz w:val="17"/>
                           <w:szCs w:val="17"/>
-                          <w:highlight w:val="yellow"/>
                         </w:rPr>
                         <w:t xml:space="preserve"/>
                       </w:r>
@@ -5339,7 +5283,6 @@
                           <w:color w:val="404040" w:themeColor="text1" w:themeTint="BF"/>
                           <w:sz w:val="18"/>
                           <w:szCs w:val="18"/>
-                          <w:highlight w:val="cyan"/>
                           <w:u w:val="single"/>
                         </w:rPr>
                         <w:t/>
@@ -7233,7 +7176,6 @@
                           <w:color w:val="404040" w:themeColor="text1" w:themeTint="BF"/>
                           <w:sz w:val="18"/>
                           <w:szCs w:val="18"/>
-                          <w:highlight w:val="yellow"/>
                         </w:rPr>
                         <w:t>GC to provide 500</w:t>
                       </w:r>
@@ -7243,7 +7185,6 @@
                           <w:color w:val="404040" w:themeColor="text1" w:themeTint="BF"/>
                           <w:sz w:val="16"/>
                           <w:szCs w:val="16"/>
-                          <w:highlight w:val="yellow"/>
                         </w:rPr>
                         <w:t xml:space="preserve"> sf of </w:t>
                       </w:r>
@@ -7253,7 +7194,6 @@
                           <w:color w:val="404040" w:themeColor="text1" w:themeTint="BF"/>
                           <w:sz w:val="18"/>
                           <w:szCs w:val="18"/>
-                          <w:highlight w:val="yellow"/>
                         </w:rPr>
                         <w:t xml:space="preserve">Onsite Covered </w:t>
                       </w:r>
@@ -7263,7 +7203,6 @@
                           <w:color w:val="404040" w:themeColor="text1" w:themeTint="BF"/>
                           <w:sz w:val="18"/>
                           <w:szCs w:val="18"/>
-                          <w:highlight w:val="yellow"/>
                         </w:rPr>
                         <w:t xml:space="preserve">Sound Mat </w:t>
                       </w:r>
@@ -7273,7 +7212,6 @@
                           <w:color w:val="404040" w:themeColor="text1" w:themeTint="BF"/>
                           <w:sz w:val="18"/>
                           <w:szCs w:val="18"/>
-                          <w:highlight w:val="yellow"/>
                         </w:rPr>
                         <w:t>Storage</w:t>
                       </w:r>
@@ -7283,7 +7221,6 @@
                           <w:color w:val="404040" w:themeColor="text1" w:themeTint="BF"/>
                           <w:sz w:val="17"/>
                           <w:szCs w:val="17"/>
-                          <w:highlight w:val="yellow"/>
                         </w:rPr>
                         <w:t xml:space="preserve">, </w:t>
                       </w:r>
@@ -7295,7 +7232,6 @@
                           <w:color w:val="404040" w:themeColor="text1" w:themeTint="BF"/>
                           <w:sz w:val="17"/>
                           <w:szCs w:val="17"/>
-                          <w:highlight w:val="yellow"/>
                         </w:rPr>
                         <w:t>if applicable</w:t>
                       </w:r>
@@ -7305,7 +7241,6 @@
                           <w:color w:val="404040" w:themeColor="text1" w:themeTint="BF"/>
                           <w:sz w:val="18"/>
                           <w:szCs w:val="18"/>
-                          <w:highlight w:val="yellow"/>
                         </w:rPr>
                         <w:t xml:space="preserve"> </w:t>
                       </w:r>
@@ -7317,7 +7252,6 @@
                           <w:color w:val="404040" w:themeColor="text1" w:themeTint="BF"/>
                           <w:sz w:val="18"/>
                           <w:szCs w:val="18"/>
-                          <w:highlight w:val="yellow"/>
                         </w:rPr>
                         <w:t>(</w:t>
                       </w:r>
@@ -7329,7 +7263,6 @@
                           <w:color w:val="404040" w:themeColor="text1" w:themeTint="BF"/>
                           <w:sz w:val="16"/>
                           <w:szCs w:val="16"/>
-                          <w:highlight w:val="yellow"/>
                         </w:rPr>
                         <w:t>see add if not available</w:t>
                       </w:r>
@@ -7341,7 +7274,6 @@
                           <w:color w:val="404040" w:themeColor="text1" w:themeTint="BF"/>
                           <w:sz w:val="18"/>
                           <w:szCs w:val="18"/>
-                          <w:highlight w:val="yellow"/>
                         </w:rPr>
                         <w:t>)</w:t>
                       </w:r>
@@ -7613,7 +7545,6 @@
                                 <w:color w:val="404040" w:themeColor="text1" w:themeTint="BF"/>
                                 <w:sz w:val="18"/>
                                 <w:szCs w:val="18"/>
-                                <w:highlight w:val="yellow"/>
                                 <w:u w:val="single"/>
                               </w:rPr>
                               <w:t/>
@@ -7626,7 +7557,6 @@
                                 <w:color w:val="404040" w:themeColor="text1" w:themeTint="BF"/>
                                 <w:sz w:val="18"/>
                                 <w:szCs w:val="18"/>
-                                <w:highlight w:val="yellow"/>
                               </w:rPr>
                               <w:t/>
                             </w:r>
@@ -7663,7 +7593,6 @@
                                 <w:color w:val="404040" w:themeColor="text1" w:themeTint="BF"/>
                                 <w:sz w:val="18"/>
                                 <w:szCs w:val="18"/>
-                                <w:highlight w:val="yellow"/>
                               </w:rPr>
                               <w:t xml:space="preserve">{{material_tax_formatted}} – Material Sales Tax</w:t>
                             </w:r>
@@ -7673,7 +7602,6 @@
                                 <w:color w:val="404040" w:themeColor="text1" w:themeTint="BF"/>
                                 <w:sz w:val="18"/>
                                 <w:szCs w:val="18"/>
-                                <w:highlight w:val="yellow"/>
                               </w:rPr>
                               <w:t xml:space="preserve"/>
                             </w:r>
@@ -7683,7 +7611,6 @@
                                 <w:color w:val="404040" w:themeColor="text1" w:themeTint="BF"/>
                                 <w:sz w:val="18"/>
                                 <w:szCs w:val="18"/>
-                                <w:highlight w:val="yellow"/>
                               </w:rPr>
                               <w:t/>
                             </w:r>
@@ -7693,7 +7620,6 @@
                                 <w:color w:val="404040" w:themeColor="text1" w:themeTint="BF"/>
                                 <w:sz w:val="18"/>
                                 <w:szCs w:val="18"/>
-                                <w:highlight w:val="yellow"/>
                               </w:rPr>
                               <w:t xml:space="preserve"/>
                             </w:r>
@@ -7703,7 +7629,6 @@
                                 <w:color w:val="404040" w:themeColor="text1" w:themeTint="BF"/>
                                 <w:sz w:val="18"/>
                                 <w:szCs w:val="18"/>
-                                <w:highlight w:val="yellow"/>
                               </w:rPr>
                               <w:t/>
                             </w:r>
@@ -7713,7 +7638,6 @@
                                 <w:color w:val="404040" w:themeColor="text1" w:themeTint="BF"/>
                                 <w:sz w:val="18"/>
                                 <w:szCs w:val="18"/>
-                                <w:highlight w:val="yellow"/>
                               </w:rPr>
                               <w:t/>
                             </w:r>
@@ -7723,7 +7647,6 @@
                                 <w:color w:val="404040" w:themeColor="text1" w:themeTint="BF"/>
                                 <w:sz w:val="18"/>
                                 <w:szCs w:val="18"/>
-                                <w:highlight w:val="yellow"/>
                               </w:rPr>
                               <w:t/>
                             </w:r>
@@ -7758,7 +7681,6 @@
                                 <w:color w:val="404040" w:themeColor="text1" w:themeTint="BF"/>
                                 <w:sz w:val="18"/>
                                 <w:szCs w:val="18"/>
-                                <w:highlight w:val="yellow"/>
                                 <w:u w:val="single"/>
                               </w:rPr>
                               <w:t xml:space="preserve">{{tax_amount_formatted}} – Kansas Remodel Tax</w:t>
@@ -7769,7 +7691,6 @@
                                 <w:color w:val="404040" w:themeColor="text1" w:themeTint="BF"/>
                                 <w:sz w:val="18"/>
                                 <w:szCs w:val="18"/>
-                                <w:highlight w:val="yellow"/>
                                 <w:u w:val="single"/>
                               </w:rPr>
                               <w:t xml:space="preserve"/>
@@ -7780,7 +7701,6 @@
                                 <w:color w:val="404040" w:themeColor="text1" w:themeTint="BF"/>
                                 <w:sz w:val="18"/>
                                 <w:szCs w:val="18"/>
-                                <w:highlight w:val="yellow"/>
                                 <w:u w:val="single"/>
                               </w:rPr>
                               <w:t xml:space="preserve"/>
@@ -7791,7 +7711,6 @@
                                 <w:color w:val="404040" w:themeColor="text1" w:themeTint="BF"/>
                                 <w:sz w:val="18"/>
                                 <w:szCs w:val="18"/>
-                                <w:highlight w:val="yellow"/>
                               </w:rPr>
                               <w:t/>
                             </w:r>
@@ -8286,7 +8205,6 @@
                           <w:color w:val="404040" w:themeColor="text1" w:themeTint="BF"/>
                           <w:sz w:val="18"/>
                           <w:szCs w:val="18"/>
-                          <w:highlight w:val="yellow"/>
                           <w:u w:val="single"/>
                         </w:rPr>
                         <w:t/>
@@ -8299,7 +8217,6 @@
                           <w:color w:val="404040" w:themeColor="text1" w:themeTint="BF"/>
                           <w:sz w:val="18"/>
                           <w:szCs w:val="18"/>
-                          <w:highlight w:val="yellow"/>
                         </w:rPr>
                         <w:t/>
                       </w:r>
@@ -8336,7 +8253,6 @@
                           <w:color w:val="404040" w:themeColor="text1" w:themeTint="BF"/>
                           <w:sz w:val="18"/>
                           <w:szCs w:val="18"/>
-                          <w:highlight w:val="yellow"/>
                         </w:rPr>
                         <w:t xml:space="preserve">{{material_tax_formatted}} – Material Sales Tax</w:t>
                       </w:r>
@@ -8346,7 +8262,6 @@
                           <w:color w:val="404040" w:themeColor="text1" w:themeTint="BF"/>
                           <w:sz w:val="18"/>
                           <w:szCs w:val="18"/>
-                          <w:highlight w:val="yellow"/>
                         </w:rPr>
                         <w:t xml:space="preserve"/>
                       </w:r>
@@ -8356,7 +8271,6 @@
                           <w:color w:val="404040" w:themeColor="text1" w:themeTint="BF"/>
                           <w:sz w:val="18"/>
                           <w:szCs w:val="18"/>
-                          <w:highlight w:val="yellow"/>
                         </w:rPr>
                         <w:t/>
                       </w:r>
@@ -8366,7 +8280,6 @@
                           <w:color w:val="404040" w:themeColor="text1" w:themeTint="BF"/>
                           <w:sz w:val="18"/>
                           <w:szCs w:val="18"/>
-                          <w:highlight w:val="yellow"/>
                         </w:rPr>
                         <w:t xml:space="preserve"/>
                       </w:r>
@@ -8376,7 +8289,6 @@
                           <w:color w:val="404040" w:themeColor="text1" w:themeTint="BF"/>
                           <w:sz w:val="18"/>
                           <w:szCs w:val="18"/>
-                          <w:highlight w:val="yellow"/>
                         </w:rPr>
                         <w:t/>
                       </w:r>
@@ -8386,7 +8298,6 @@
                           <w:color w:val="404040" w:themeColor="text1" w:themeTint="BF"/>
                           <w:sz w:val="18"/>
                           <w:szCs w:val="18"/>
-                          <w:highlight w:val="yellow"/>
                         </w:rPr>
                         <w:t/>
                       </w:r>
@@ -8396,7 +8307,6 @@
                           <w:color w:val="404040" w:themeColor="text1" w:themeTint="BF"/>
                           <w:sz w:val="18"/>
                           <w:szCs w:val="18"/>
-                          <w:highlight w:val="yellow"/>
                         </w:rPr>
                         <w:t/>
                       </w:r>
@@ -8431,7 +8341,6 @@
                           <w:color w:val="404040" w:themeColor="text1" w:themeTint="BF"/>
                           <w:sz w:val="18"/>
                           <w:szCs w:val="18"/>
-                          <w:highlight w:val="yellow"/>
                           <w:u w:val="single"/>
                         </w:rPr>
                         <w:t xml:space="preserve">{{tax_amount_formatted}} – Kansas Remodel Tax</w:t>
@@ -8442,7 +8351,6 @@
                           <w:color w:val="404040" w:themeColor="text1" w:themeTint="BF"/>
                           <w:sz w:val="18"/>
                           <w:szCs w:val="18"/>
-                          <w:highlight w:val="yellow"/>
                           <w:u w:val="single"/>
                         </w:rPr>
                         <w:t xml:space="preserve"/>
@@ -8453,7 +8361,6 @@
                           <w:color w:val="404040" w:themeColor="text1" w:themeTint="BF"/>
                           <w:sz w:val="18"/>
                           <w:szCs w:val="18"/>
-                          <w:highlight w:val="yellow"/>
                           <w:u w:val="single"/>
                         </w:rPr>
                         <w:t xml:space="preserve"/>
@@ -8464,7 +8371,6 @@
                           <w:color w:val="404040" w:themeColor="text1" w:themeTint="BF"/>
                           <w:sz w:val="18"/>
                           <w:szCs w:val="18"/>
-                          <w:highlight w:val="yellow"/>
                         </w:rPr>
                         <w:t/>
                       </w:r>

</xml_diff>

<commit_message>
prod: proposal formatting batch + editable recipient + staff-drawer sent_to
Promotes the staging proposal-tool delta (8 files) to prod:
- proposal_writer.py + gyp template: pricing fallback, WORK-clip font shrink,
  Terms & Conditions forced onto its own page (all templates), gyp/polish box
  top insets, gyp base-bid "sales tax INCLUDED" wording fix, gyp review
  highlights removed (#144-#151).
- frontend done.html/done.js: editable intake recipient + inline PDF preview +
  fit-to-width popup (#143).
- frontend portal.js: staff-drawer customer-recorded "sent to" deposit details
  (#142/#152) — inert until the Customer Portal prod stack is live.

Customer Portal (portal.wetreadwell.com) prod rollout is separate + still held
on infra (Resend key, service token, portal_app DB setup).

Co-Authored-By: Claude Opus 4.8 (1M context) <noreply@anthropic.com>
</commit_message>
<xml_diff>
--- a/backend/templates/Gyp/xx TREADWELL UNDERLAYMENT PROPOSAL - xx.docx
+++ b/backend/templates/Gyp/xx TREADWELL UNDERLAYMENT PROPOSAL - xx.docx
@@ -749,7 +749,6 @@
                                 <w:color w:val="404040" w:themeColor="text1" w:themeTint="BF"/>
                                 <w:sz w:val="18"/>
                                 <w:szCs w:val="18"/>
-                                <w:highlight w:val="yellow"/>
                                 <w:u w:val="single"/>
                               </w:rPr>
                               <w:t/>
@@ -821,7 +820,6 @@
                                 <w:color w:val="404040" w:themeColor="text1" w:themeTint="BF"/>
                                 <w:sz w:val="18"/>
                                 <w:szCs w:val="18"/>
-                                <w:highlight w:val="yellow"/>
                               </w:rPr>
                               <w:t/>
                             </w:r>
@@ -833,7 +831,6 @@
                                 <w:color w:val="404040" w:themeColor="text1" w:themeTint="BF"/>
                                 <w:sz w:val="18"/>
                                 <w:szCs w:val="18"/>
-                                <w:highlight w:val="yellow"/>
                                 <w:u w:val="single"/>
                               </w:rPr>
                               <w:t/>
@@ -846,7 +843,6 @@
                                 <w:color w:val="404040" w:themeColor="text1" w:themeTint="BF"/>
                                 <w:sz w:val="18"/>
                                 <w:szCs w:val="18"/>
-                                <w:highlight w:val="yellow"/>
                               </w:rPr>
                               <w:t/>
                             </w:r>
@@ -1031,7 +1027,6 @@
                                 <w:color w:val="404040" w:themeColor="text1" w:themeTint="BF"/>
                                 <w:sz w:val="18"/>
                                 <w:szCs w:val="18"/>
-                                <w:highlight w:val="yellow"/>
                               </w:rPr>
                               <w:t/>
                             </w:r>
@@ -1041,7 +1036,6 @@
                                 <w:color w:val="404040" w:themeColor="text1" w:themeTint="BF"/>
                                 <w:sz w:val="17"/>
                                 <w:szCs w:val="17"/>
-                                <w:highlight w:val="yellow"/>
                               </w:rPr>
                               <w:t xml:space="preserve"/>
                             </w:r>
@@ -1051,7 +1045,6 @@
                                 <w:color w:val="404040" w:themeColor="text1" w:themeTint="BF"/>
                                 <w:sz w:val="17"/>
                                 <w:szCs w:val="17"/>
-                                <w:highlight w:val="yellow"/>
                               </w:rPr>
                               <w:t xml:space="preserve"/>
                             </w:r>
@@ -1081,7 +1074,6 @@
                                 <w:color w:val="404040" w:themeColor="text1" w:themeTint="BF"/>
                                 <w:sz w:val="18"/>
                                 <w:szCs w:val="18"/>
-                                <w:highlight w:val="cyan"/>
                                 <w:u w:val="single"/>
                               </w:rPr>
                               <w:t/>
@@ -1392,7 +1384,6 @@
                                 <w:color w:val="404040" w:themeColor="text1" w:themeTint="BF"/>
                                 <w:sz w:val="18"/>
                                 <w:szCs w:val="18"/>
-                                <w:highlight w:val="yellow"/>
                               </w:rPr>
                               <w:t/>
                             </w:r>
@@ -1402,7 +1393,6 @@
                                 <w:color w:val="404040" w:themeColor="text1" w:themeTint="BF"/>
                                 <w:sz w:val="17"/>
                                 <w:szCs w:val="17"/>
-                                <w:highlight w:val="yellow"/>
                               </w:rPr>
                               <w:t xml:space="preserve"/>
                             </w:r>
@@ -1486,7 +1476,6 @@
                                 <w:color w:val="404040" w:themeColor="text1" w:themeTint="BF"/>
                                 <w:sz w:val="18"/>
                                 <w:szCs w:val="18"/>
-                                <w:highlight w:val="cyan"/>
                                 <w:u w:val="single"/>
                               </w:rPr>
                               <w:t/>
@@ -1541,7 +1530,6 @@
                                 <w:color w:val="404040" w:themeColor="text1" w:themeTint="BF"/>
                                 <w:sz w:val="17"/>
                                 <w:szCs w:val="17"/>
-                                <w:highlight w:val="yellow"/>
                                 <w:u w:val="single"/>
                               </w:rPr>
                               <w:t/>
@@ -1554,7 +1542,6 @@
                                 <w:color w:val="404040" w:themeColor="text1" w:themeTint="BF"/>
                                 <w:sz w:val="17"/>
                                 <w:szCs w:val="17"/>
-                                <w:highlight w:val="yellow"/>
                                 <w:u w:val="single"/>
                               </w:rPr>
                               <w:t/>
@@ -1567,7 +1554,6 @@
                                 <w:color w:val="404040" w:themeColor="text1" w:themeTint="BF"/>
                                 <w:sz w:val="16"/>
                                 <w:szCs w:val="16"/>
-                                <w:highlight w:val="yellow"/>
                                 <w:u w:val="single"/>
                               </w:rPr>
                               <w:t xml:space="preserve"/>
@@ -1578,7 +1564,6 @@
                                 <w:color w:val="404040" w:themeColor="text1" w:themeTint="BF"/>
                                 <w:sz w:val="16"/>
                                 <w:szCs w:val="16"/>
-                                <w:highlight w:val="yellow"/>
                                 <w:u w:val="single"/>
                               </w:rPr>
                               <w:t/>
@@ -1591,7 +1576,6 @@
                                 <w:color w:val="404040" w:themeColor="text1" w:themeTint="BF"/>
                                 <w:sz w:val="16"/>
                                 <w:szCs w:val="16"/>
-                                <w:highlight w:val="yellow"/>
                                 <w:u w:val="single"/>
                               </w:rPr>
                               <w:t xml:space="preserve"/>
@@ -1604,7 +1588,6 @@
                                 <w:color w:val="404040" w:themeColor="text1" w:themeTint="BF"/>
                                 <w:sz w:val="18"/>
                                 <w:szCs w:val="18"/>
-                                <w:highlight w:val="yellow"/>
                                 <w:u w:val="single"/>
                               </w:rPr>
                               <w:t/>
@@ -1615,7 +1598,6 @@
                                 <w:color w:val="404040" w:themeColor="text1" w:themeTint="BF"/>
                                 <w:sz w:val="16"/>
                                 <w:szCs w:val="16"/>
-                                <w:highlight w:val="yellow"/>
                                 <w:u w:val="single"/>
                               </w:rPr>
                               <w:t/>
@@ -1628,7 +1610,6 @@
                                 <w:color w:val="404040" w:themeColor="text1" w:themeTint="BF"/>
                                 <w:sz w:val="18"/>
                                 <w:szCs w:val="18"/>
-                                <w:highlight w:val="yellow"/>
                                 <w:u w:val="single"/>
                               </w:rPr>
                               <w:t/>
@@ -1674,7 +1655,6 @@
                                 <w:color w:val="404040" w:themeColor="text1" w:themeTint="BF"/>
                                 <w:sz w:val="18"/>
                                 <w:szCs w:val="18"/>
-                                <w:highlight w:val="yellow"/>
                               </w:rPr>
                               <w:t xml:space="preserve">USG </w:t>
                             </w:r>
@@ -1921,7 +1901,6 @@
                                 <w:color w:val="404040" w:themeColor="text1" w:themeTint="BF"/>
                                 <w:sz w:val="18"/>
                                 <w:szCs w:val="18"/>
-                                <w:highlight w:val="yellow"/>
                               </w:rPr>
                               <w:t/>
                             </w:r>
@@ -1931,7 +1910,6 @@
                                 <w:color w:val="404040" w:themeColor="text1" w:themeTint="BF"/>
                                 <w:sz w:val="17"/>
                                 <w:szCs w:val="17"/>
-                                <w:highlight w:val="yellow"/>
                               </w:rPr>
                               <w:t xml:space="preserve"/>
                             </w:r>
@@ -1979,7 +1957,6 @@
                                 <w:color w:val="404040" w:themeColor="text1" w:themeTint="BF"/>
                                 <w:sz w:val="18"/>
                                 <w:szCs w:val="18"/>
-                                <w:highlight w:val="cyan"/>
                                 <w:u w:val="single"/>
                               </w:rPr>
                               <w:t/>
@@ -3873,7 +3850,6 @@
                                 <w:color w:val="404040" w:themeColor="text1" w:themeTint="BF"/>
                                 <w:sz w:val="18"/>
                                 <w:szCs w:val="18"/>
-                                <w:highlight w:val="yellow"/>
                               </w:rPr>
                               <w:t>GC to provide 500</w:t>
                             </w:r>
@@ -3883,7 +3859,6 @@
                                 <w:color w:val="404040" w:themeColor="text1" w:themeTint="BF"/>
                                 <w:sz w:val="16"/>
                                 <w:szCs w:val="16"/>
-                                <w:highlight w:val="yellow"/>
                               </w:rPr>
                               <w:t xml:space="preserve"> sf of </w:t>
                             </w:r>
@@ -3893,7 +3868,6 @@
                                 <w:color w:val="404040" w:themeColor="text1" w:themeTint="BF"/>
                                 <w:sz w:val="18"/>
                                 <w:szCs w:val="18"/>
-                                <w:highlight w:val="yellow"/>
                               </w:rPr>
                               <w:t xml:space="preserve">Onsite Covered </w:t>
                             </w:r>
@@ -3903,7 +3877,6 @@
                                 <w:color w:val="404040" w:themeColor="text1" w:themeTint="BF"/>
                                 <w:sz w:val="18"/>
                                 <w:szCs w:val="18"/>
-                                <w:highlight w:val="yellow"/>
                               </w:rPr>
                               <w:t xml:space="preserve">Sound Mat </w:t>
                             </w:r>
@@ -3913,7 +3886,6 @@
                                 <w:color w:val="404040" w:themeColor="text1" w:themeTint="BF"/>
                                 <w:sz w:val="18"/>
                                 <w:szCs w:val="18"/>
-                                <w:highlight w:val="yellow"/>
                               </w:rPr>
                               <w:t>Storage</w:t>
                             </w:r>
@@ -3923,7 +3895,6 @@
                                 <w:color w:val="404040" w:themeColor="text1" w:themeTint="BF"/>
                                 <w:sz w:val="17"/>
                                 <w:szCs w:val="17"/>
-                                <w:highlight w:val="yellow"/>
                               </w:rPr>
                               <w:t xml:space="preserve">, </w:t>
                             </w:r>
@@ -3935,7 +3906,6 @@
                                 <w:color w:val="404040" w:themeColor="text1" w:themeTint="BF"/>
                                 <w:sz w:val="17"/>
                                 <w:szCs w:val="17"/>
-                                <w:highlight w:val="yellow"/>
                               </w:rPr>
                               <w:t>if applicable</w:t>
                             </w:r>
@@ -3945,7 +3915,6 @@
                                 <w:color w:val="404040" w:themeColor="text1" w:themeTint="BF"/>
                                 <w:sz w:val="18"/>
                                 <w:szCs w:val="18"/>
-                                <w:highlight w:val="yellow"/>
                               </w:rPr>
                               <w:t xml:space="preserve"> </w:t>
                             </w:r>
@@ -3957,7 +3926,6 @@
                                 <w:color w:val="404040" w:themeColor="text1" w:themeTint="BF"/>
                                 <w:sz w:val="18"/>
                                 <w:szCs w:val="18"/>
-                                <w:highlight w:val="yellow"/>
                               </w:rPr>
                               <w:t>(</w:t>
                             </w:r>
@@ -3969,7 +3937,6 @@
                                 <w:color w:val="404040" w:themeColor="text1" w:themeTint="BF"/>
                                 <w:sz w:val="16"/>
                                 <w:szCs w:val="16"/>
-                                <w:highlight w:val="yellow"/>
                               </w:rPr>
                               <w:t>see add if not available</w:t>
                             </w:r>
@@ -3981,7 +3948,6 @@
                                 <w:color w:val="404040" w:themeColor="text1" w:themeTint="BF"/>
                                 <w:sz w:val="18"/>
                                 <w:szCs w:val="18"/>
-                                <w:highlight w:val="yellow"/>
                               </w:rPr>
                               <w:t>)</w:t>
                             </w:r>
@@ -4109,7 +4075,6 @@
                           <w:color w:val="404040" w:themeColor="text1" w:themeTint="BF"/>
                           <w:sz w:val="18"/>
                           <w:szCs w:val="18"/>
-                          <w:highlight w:val="yellow"/>
                           <w:u w:val="single"/>
                         </w:rPr>
                         <w:t/>
@@ -4181,7 +4146,6 @@
                           <w:color w:val="404040" w:themeColor="text1" w:themeTint="BF"/>
                           <w:sz w:val="18"/>
                           <w:szCs w:val="18"/>
-                          <w:highlight w:val="yellow"/>
                         </w:rPr>
                         <w:t/>
                       </w:r>
@@ -4193,7 +4157,6 @@
                           <w:color w:val="404040" w:themeColor="text1" w:themeTint="BF"/>
                           <w:sz w:val="18"/>
                           <w:szCs w:val="18"/>
-                          <w:highlight w:val="yellow"/>
                           <w:u w:val="single"/>
                         </w:rPr>
                         <w:t/>
@@ -4206,7 +4169,6 @@
                           <w:color w:val="404040" w:themeColor="text1" w:themeTint="BF"/>
                           <w:sz w:val="18"/>
                           <w:szCs w:val="18"/>
-                          <w:highlight w:val="yellow"/>
                         </w:rPr>
                         <w:t/>
                       </w:r>
@@ -4391,7 +4353,6 @@
                           <w:color w:val="404040" w:themeColor="text1" w:themeTint="BF"/>
                           <w:sz w:val="18"/>
                           <w:szCs w:val="18"/>
-                          <w:highlight w:val="yellow"/>
                         </w:rPr>
                         <w:t/>
                       </w:r>
@@ -4401,7 +4362,6 @@
                           <w:color w:val="404040" w:themeColor="text1" w:themeTint="BF"/>
                           <w:sz w:val="17"/>
                           <w:szCs w:val="17"/>
-                          <w:highlight w:val="yellow"/>
                         </w:rPr>
                         <w:t xml:space="preserve"/>
                       </w:r>
@@ -4411,7 +4371,6 @@
                           <w:color w:val="404040" w:themeColor="text1" w:themeTint="BF"/>
                           <w:sz w:val="17"/>
                           <w:szCs w:val="17"/>
-                          <w:highlight w:val="yellow"/>
                         </w:rPr>
                         <w:t xml:space="preserve"/>
                       </w:r>
@@ -4441,7 +4400,6 @@
                           <w:color w:val="404040" w:themeColor="text1" w:themeTint="BF"/>
                           <w:sz w:val="18"/>
                           <w:szCs w:val="18"/>
-                          <w:highlight w:val="cyan"/>
                           <w:u w:val="single"/>
                         </w:rPr>
                         <w:t/>
@@ -4752,7 +4710,6 @@
                           <w:color w:val="404040" w:themeColor="text1" w:themeTint="BF"/>
                           <w:sz w:val="18"/>
                           <w:szCs w:val="18"/>
-                          <w:highlight w:val="yellow"/>
                         </w:rPr>
                         <w:t/>
                       </w:r>
@@ -4762,7 +4719,6 @@
                           <w:color w:val="404040" w:themeColor="text1" w:themeTint="BF"/>
                           <w:sz w:val="17"/>
                           <w:szCs w:val="17"/>
-                          <w:highlight w:val="yellow"/>
                         </w:rPr>
                         <w:t xml:space="preserve"/>
                       </w:r>
@@ -4846,7 +4802,6 @@
                           <w:color w:val="404040" w:themeColor="text1" w:themeTint="BF"/>
                           <w:sz w:val="18"/>
                           <w:szCs w:val="18"/>
-                          <w:highlight w:val="cyan"/>
                           <w:u w:val="single"/>
                         </w:rPr>
                         <w:t/>
@@ -4901,7 +4856,6 @@
                           <w:color w:val="404040" w:themeColor="text1" w:themeTint="BF"/>
                           <w:sz w:val="17"/>
                           <w:szCs w:val="17"/>
-                          <w:highlight w:val="yellow"/>
                           <w:u w:val="single"/>
                         </w:rPr>
                         <w:t/>
@@ -4914,7 +4868,6 @@
                           <w:color w:val="404040" w:themeColor="text1" w:themeTint="BF"/>
                           <w:sz w:val="17"/>
                           <w:szCs w:val="17"/>
-                          <w:highlight w:val="yellow"/>
                           <w:u w:val="single"/>
                         </w:rPr>
                         <w:t/>
@@ -4927,7 +4880,6 @@
                           <w:color w:val="404040" w:themeColor="text1" w:themeTint="BF"/>
                           <w:sz w:val="16"/>
                           <w:szCs w:val="16"/>
-                          <w:highlight w:val="yellow"/>
                           <w:u w:val="single"/>
                         </w:rPr>
                         <w:t xml:space="preserve"/>
@@ -4938,7 +4890,6 @@
                           <w:color w:val="404040" w:themeColor="text1" w:themeTint="BF"/>
                           <w:sz w:val="16"/>
                           <w:szCs w:val="16"/>
-                          <w:highlight w:val="yellow"/>
                           <w:u w:val="single"/>
                         </w:rPr>
                         <w:t/>
@@ -4951,7 +4902,6 @@
                           <w:color w:val="404040" w:themeColor="text1" w:themeTint="BF"/>
                           <w:sz w:val="16"/>
                           <w:szCs w:val="16"/>
-                          <w:highlight w:val="yellow"/>
                           <w:u w:val="single"/>
                         </w:rPr>
                         <w:t xml:space="preserve"/>
@@ -4964,7 +4914,6 @@
                           <w:color w:val="404040" w:themeColor="text1" w:themeTint="BF"/>
                           <w:sz w:val="18"/>
                           <w:szCs w:val="18"/>
-                          <w:highlight w:val="yellow"/>
                           <w:u w:val="single"/>
                         </w:rPr>
                         <w:t/>
@@ -4975,7 +4924,6 @@
                           <w:color w:val="404040" w:themeColor="text1" w:themeTint="BF"/>
                           <w:sz w:val="16"/>
                           <w:szCs w:val="16"/>
-                          <w:highlight w:val="yellow"/>
                           <w:u w:val="single"/>
                         </w:rPr>
                         <w:t/>
@@ -4988,7 +4936,6 @@
                           <w:color w:val="404040" w:themeColor="text1" w:themeTint="BF"/>
                           <w:sz w:val="18"/>
                           <w:szCs w:val="18"/>
-                          <w:highlight w:val="yellow"/>
                           <w:u w:val="single"/>
                         </w:rPr>
                         <w:t/>
@@ -5034,7 +4981,6 @@
                           <w:color w:val="404040" w:themeColor="text1" w:themeTint="BF"/>
                           <w:sz w:val="18"/>
                           <w:szCs w:val="18"/>
-                          <w:highlight w:val="yellow"/>
                         </w:rPr>
                         <w:t xml:space="preserve">USG </w:t>
                       </w:r>
@@ -5281,7 +5227,6 @@
                           <w:color w:val="404040" w:themeColor="text1" w:themeTint="BF"/>
                           <w:sz w:val="18"/>
                           <w:szCs w:val="18"/>
-                          <w:highlight w:val="yellow"/>
                         </w:rPr>
                         <w:t/>
                       </w:r>
@@ -5291,7 +5236,6 @@
                           <w:color w:val="404040" w:themeColor="text1" w:themeTint="BF"/>
                           <w:sz w:val="17"/>
                           <w:szCs w:val="17"/>
-                          <w:highlight w:val="yellow"/>
                         </w:rPr>
                         <w:t xml:space="preserve"/>
                       </w:r>
@@ -5339,7 +5283,6 @@
                           <w:color w:val="404040" w:themeColor="text1" w:themeTint="BF"/>
                           <w:sz w:val="18"/>
                           <w:szCs w:val="18"/>
-                          <w:highlight w:val="cyan"/>
                           <w:u w:val="single"/>
                         </w:rPr>
                         <w:t/>
@@ -7233,7 +7176,6 @@
                           <w:color w:val="404040" w:themeColor="text1" w:themeTint="BF"/>
                           <w:sz w:val="18"/>
                           <w:szCs w:val="18"/>
-                          <w:highlight w:val="yellow"/>
                         </w:rPr>
                         <w:t>GC to provide 500</w:t>
                       </w:r>
@@ -7243,7 +7185,6 @@
                           <w:color w:val="404040" w:themeColor="text1" w:themeTint="BF"/>
                           <w:sz w:val="16"/>
                           <w:szCs w:val="16"/>
-                          <w:highlight w:val="yellow"/>
                         </w:rPr>
                         <w:t xml:space="preserve"> sf of </w:t>
                       </w:r>
@@ -7253,7 +7194,6 @@
                           <w:color w:val="404040" w:themeColor="text1" w:themeTint="BF"/>
                           <w:sz w:val="18"/>
                           <w:szCs w:val="18"/>
-                          <w:highlight w:val="yellow"/>
                         </w:rPr>
                         <w:t xml:space="preserve">Onsite Covered </w:t>
                       </w:r>
@@ -7263,7 +7203,6 @@
                           <w:color w:val="404040" w:themeColor="text1" w:themeTint="BF"/>
                           <w:sz w:val="18"/>
                           <w:szCs w:val="18"/>
-                          <w:highlight w:val="yellow"/>
                         </w:rPr>
                         <w:t xml:space="preserve">Sound Mat </w:t>
                       </w:r>
@@ -7273,7 +7212,6 @@
                           <w:color w:val="404040" w:themeColor="text1" w:themeTint="BF"/>
                           <w:sz w:val="18"/>
                           <w:szCs w:val="18"/>
-                          <w:highlight w:val="yellow"/>
                         </w:rPr>
                         <w:t>Storage</w:t>
                       </w:r>
@@ -7283,7 +7221,6 @@
                           <w:color w:val="404040" w:themeColor="text1" w:themeTint="BF"/>
                           <w:sz w:val="17"/>
                           <w:szCs w:val="17"/>
-                          <w:highlight w:val="yellow"/>
                         </w:rPr>
                         <w:t xml:space="preserve">, </w:t>
                       </w:r>
@@ -7295,7 +7232,6 @@
                           <w:color w:val="404040" w:themeColor="text1" w:themeTint="BF"/>
                           <w:sz w:val="17"/>
                           <w:szCs w:val="17"/>
-                          <w:highlight w:val="yellow"/>
                         </w:rPr>
                         <w:t>if applicable</w:t>
                       </w:r>
@@ -7305,7 +7241,6 @@
                           <w:color w:val="404040" w:themeColor="text1" w:themeTint="BF"/>
                           <w:sz w:val="18"/>
                           <w:szCs w:val="18"/>
-                          <w:highlight w:val="yellow"/>
                         </w:rPr>
                         <w:t xml:space="preserve"> </w:t>
                       </w:r>
@@ -7317,7 +7252,6 @@
                           <w:color w:val="404040" w:themeColor="text1" w:themeTint="BF"/>
                           <w:sz w:val="18"/>
                           <w:szCs w:val="18"/>
-                          <w:highlight w:val="yellow"/>
                         </w:rPr>
                         <w:t>(</w:t>
                       </w:r>
@@ -7329,7 +7263,6 @@
                           <w:color w:val="404040" w:themeColor="text1" w:themeTint="BF"/>
                           <w:sz w:val="16"/>
                           <w:szCs w:val="16"/>
-                          <w:highlight w:val="yellow"/>
                         </w:rPr>
                         <w:t>see add if not available</w:t>
                       </w:r>
@@ -7341,7 +7274,6 @@
                           <w:color w:val="404040" w:themeColor="text1" w:themeTint="BF"/>
                           <w:sz w:val="18"/>
                           <w:szCs w:val="18"/>
-                          <w:highlight w:val="yellow"/>
                         </w:rPr>
                         <w:t>)</w:t>
                       </w:r>
@@ -7525,7 +7457,7 @@
                                 <w:sz w:val="20"/>
                                 <w:szCs w:val="20"/>
                               </w:rPr>
-                              <w:t xml:space="preserve">{{base_bid_formatted}} – Gypsum Underlayment System as described above (material sales tax INCLUDED)</w:t>
+                              <w:t xml:space="preserve">{{base_bid_formatted}} – Gypsum Underlayment System as described above {{base_tax_phrase}}</w:t>
                             </w:r>
                             <w:r>
                               <w:rPr>
@@ -7613,7 +7545,6 @@
                                 <w:color w:val="404040" w:themeColor="text1" w:themeTint="BF"/>
                                 <w:sz w:val="18"/>
                                 <w:szCs w:val="18"/>
-                                <w:highlight w:val="yellow"/>
                                 <w:u w:val="single"/>
                               </w:rPr>
                               <w:t/>
@@ -7626,7 +7557,6 @@
                                 <w:color w:val="404040" w:themeColor="text1" w:themeTint="BF"/>
                                 <w:sz w:val="18"/>
                                 <w:szCs w:val="18"/>
-                                <w:highlight w:val="yellow"/>
                               </w:rPr>
                               <w:t/>
                             </w:r>
@@ -7663,7 +7593,6 @@
                                 <w:color w:val="404040" w:themeColor="text1" w:themeTint="BF"/>
                                 <w:sz w:val="18"/>
                                 <w:szCs w:val="18"/>
-                                <w:highlight w:val="yellow"/>
                               </w:rPr>
                               <w:t xml:space="preserve">{{material_tax_formatted}} – Material Sales Tax</w:t>
                             </w:r>
@@ -7673,7 +7602,6 @@
                                 <w:color w:val="404040" w:themeColor="text1" w:themeTint="BF"/>
                                 <w:sz w:val="18"/>
                                 <w:szCs w:val="18"/>
-                                <w:highlight w:val="yellow"/>
                               </w:rPr>
                               <w:t xml:space="preserve"/>
                             </w:r>
@@ -7683,7 +7611,6 @@
                                 <w:color w:val="404040" w:themeColor="text1" w:themeTint="BF"/>
                                 <w:sz w:val="18"/>
                                 <w:szCs w:val="18"/>
-                                <w:highlight w:val="yellow"/>
                               </w:rPr>
                               <w:t/>
                             </w:r>
@@ -7693,7 +7620,6 @@
                                 <w:color w:val="404040" w:themeColor="text1" w:themeTint="BF"/>
                                 <w:sz w:val="18"/>
                                 <w:szCs w:val="18"/>
-                                <w:highlight w:val="yellow"/>
                               </w:rPr>
                               <w:t xml:space="preserve"/>
                             </w:r>
@@ -7703,7 +7629,6 @@
                                 <w:color w:val="404040" w:themeColor="text1" w:themeTint="BF"/>
                                 <w:sz w:val="18"/>
                                 <w:szCs w:val="18"/>
-                                <w:highlight w:val="yellow"/>
                               </w:rPr>
                               <w:t/>
                             </w:r>
@@ -7713,7 +7638,6 @@
                                 <w:color w:val="404040" w:themeColor="text1" w:themeTint="BF"/>
                                 <w:sz w:val="18"/>
                                 <w:szCs w:val="18"/>
-                                <w:highlight w:val="yellow"/>
                               </w:rPr>
                               <w:t/>
                             </w:r>
@@ -7723,7 +7647,6 @@
                                 <w:color w:val="404040" w:themeColor="text1" w:themeTint="BF"/>
                                 <w:sz w:val="18"/>
                                 <w:szCs w:val="18"/>
-                                <w:highlight w:val="yellow"/>
                               </w:rPr>
                               <w:t/>
                             </w:r>
@@ -7758,7 +7681,6 @@
                                 <w:color w:val="404040" w:themeColor="text1" w:themeTint="BF"/>
                                 <w:sz w:val="18"/>
                                 <w:szCs w:val="18"/>
-                                <w:highlight w:val="yellow"/>
                                 <w:u w:val="single"/>
                               </w:rPr>
                               <w:t xml:space="preserve">{{tax_amount_formatted}} – Kansas Remodel Tax</w:t>
@@ -7769,7 +7691,6 @@
                                 <w:color w:val="404040" w:themeColor="text1" w:themeTint="BF"/>
                                 <w:sz w:val="18"/>
                                 <w:szCs w:val="18"/>
-                                <w:highlight w:val="yellow"/>
                                 <w:u w:val="single"/>
                               </w:rPr>
                               <w:t xml:space="preserve"/>
@@ -7780,7 +7701,6 @@
                                 <w:color w:val="404040" w:themeColor="text1" w:themeTint="BF"/>
                                 <w:sz w:val="18"/>
                                 <w:szCs w:val="18"/>
-                                <w:highlight w:val="yellow"/>
                                 <w:u w:val="single"/>
                               </w:rPr>
                               <w:t xml:space="preserve"/>
@@ -7791,7 +7711,6 @@
                                 <w:color w:val="404040" w:themeColor="text1" w:themeTint="BF"/>
                                 <w:sz w:val="18"/>
                                 <w:szCs w:val="18"/>
-                                <w:highlight w:val="yellow"/>
                               </w:rPr>
                               <w:t/>
                             </w:r>
@@ -8198,7 +8117,7 @@
                           <w:sz w:val="20"/>
                           <w:szCs w:val="20"/>
                         </w:rPr>
-                        <w:t xml:space="preserve">{{base_bid_formatted}} – Gypsum Underlayment System as described above (material sales tax INCLUDED)</w:t>
+                        <w:t xml:space="preserve">{{base_bid_formatted}} – Gypsum Underlayment System as described above {{base_tax_phrase}}</w:t>
                       </w:r>
                       <w:r>
                         <w:rPr>
@@ -8286,7 +8205,6 @@
                           <w:color w:val="404040" w:themeColor="text1" w:themeTint="BF"/>
                           <w:sz w:val="18"/>
                           <w:szCs w:val="18"/>
-                          <w:highlight w:val="yellow"/>
                           <w:u w:val="single"/>
                         </w:rPr>
                         <w:t/>
@@ -8299,7 +8217,6 @@
                           <w:color w:val="404040" w:themeColor="text1" w:themeTint="BF"/>
                           <w:sz w:val="18"/>
                           <w:szCs w:val="18"/>
-                          <w:highlight w:val="yellow"/>
                         </w:rPr>
                         <w:t/>
                       </w:r>
@@ -8336,7 +8253,6 @@
                           <w:color w:val="404040" w:themeColor="text1" w:themeTint="BF"/>
                           <w:sz w:val="18"/>
                           <w:szCs w:val="18"/>
-                          <w:highlight w:val="yellow"/>
                         </w:rPr>
                         <w:t xml:space="preserve">{{material_tax_formatted}} – Material Sales Tax</w:t>
                       </w:r>
@@ -8346,7 +8262,6 @@
                           <w:color w:val="404040" w:themeColor="text1" w:themeTint="BF"/>
                           <w:sz w:val="18"/>
                           <w:szCs w:val="18"/>
-                          <w:highlight w:val="yellow"/>
                         </w:rPr>
                         <w:t xml:space="preserve"/>
                       </w:r>
@@ -8356,7 +8271,6 @@
                           <w:color w:val="404040" w:themeColor="text1" w:themeTint="BF"/>
                           <w:sz w:val="18"/>
                           <w:szCs w:val="18"/>
-                          <w:highlight w:val="yellow"/>
                         </w:rPr>
                         <w:t/>
                       </w:r>
@@ -8366,7 +8280,6 @@
                           <w:color w:val="404040" w:themeColor="text1" w:themeTint="BF"/>
                           <w:sz w:val="18"/>
                           <w:szCs w:val="18"/>
-                          <w:highlight w:val="yellow"/>
                         </w:rPr>
                         <w:t xml:space="preserve"/>
                       </w:r>
@@ -8376,7 +8289,6 @@
                           <w:color w:val="404040" w:themeColor="text1" w:themeTint="BF"/>
                           <w:sz w:val="18"/>
                           <w:szCs w:val="18"/>
-                          <w:highlight w:val="yellow"/>
                         </w:rPr>
                         <w:t/>
                       </w:r>
@@ -8386,7 +8298,6 @@
                           <w:color w:val="404040" w:themeColor="text1" w:themeTint="BF"/>
                           <w:sz w:val="18"/>
                           <w:szCs w:val="18"/>
-                          <w:highlight w:val="yellow"/>
                         </w:rPr>
                         <w:t/>
                       </w:r>
@@ -8396,7 +8307,6 @@
                           <w:color w:val="404040" w:themeColor="text1" w:themeTint="BF"/>
                           <w:sz w:val="18"/>
                           <w:szCs w:val="18"/>
-                          <w:highlight w:val="yellow"/>
                         </w:rPr>
                         <w:t/>
                       </w:r>
@@ -8431,7 +8341,6 @@
                           <w:color w:val="404040" w:themeColor="text1" w:themeTint="BF"/>
                           <w:sz w:val="18"/>
                           <w:szCs w:val="18"/>
-                          <w:highlight w:val="yellow"/>
                           <w:u w:val="single"/>
                         </w:rPr>
                         <w:t xml:space="preserve">{{tax_amount_formatted}} – Kansas Remodel Tax</w:t>
@@ -8442,7 +8351,6 @@
                           <w:color w:val="404040" w:themeColor="text1" w:themeTint="BF"/>
                           <w:sz w:val="18"/>
                           <w:szCs w:val="18"/>
-                          <w:highlight w:val="yellow"/>
                           <w:u w:val="single"/>
                         </w:rPr>
                         <w:t xml:space="preserve"/>
@@ -8453,7 +8361,6 @@
                           <w:color w:val="404040" w:themeColor="text1" w:themeTint="BF"/>
                           <w:sz w:val="18"/>
                           <w:szCs w:val="18"/>
-                          <w:highlight w:val="yellow"/>
                           <w:u w:val="single"/>
                         </w:rPr>
                         <w:t xml:space="preserve"/>
@@ -8464,7 +8371,6 @@
                           <w:color w:val="404040" w:themeColor="text1" w:themeTint="BF"/>
                           <w:sz w:val="18"/>
                           <w:szCs w:val="18"/>
-                          <w:highlight w:val="yellow"/>
                         </w:rPr>
                         <w:t/>
                       </w:r>

</xml_diff>

<commit_message>
prod: proposal formatting batch + editable recipient + staff-drawer sent_to (#153)
Promotes the staging proposal-tool delta (8 files) to prod:
- proposal_writer.py + gyp template: pricing fallback, WORK-clip font shrink,
  Terms & Conditions forced onto its own page (all templates), gyp/polish box
  top insets, gyp base-bid "sales tax INCLUDED" wording fix, gyp review
  highlights removed (#144-#151).
- frontend done.html/done.js: editable intake recipient + inline PDF preview +
  fit-to-width popup (#143).
- frontend portal.js: staff-drawer customer-recorded "sent to" deposit details
  (#142/#152) — inert until the Customer Portal prod stack is live.

Customer Portal (portal.wetreadwell.com) prod rollout is separate + still held
on infra (Resend key, service token, portal_app DB setup).

Co-authored-by: internz2026-sys <internz.2026@gmail.com>
Co-authored-by: Claude Opus 4.8 (1M context) <noreply@anthropic.com>
</commit_message>
<xml_diff>
--- a/backend/templates/Gyp/xx TREADWELL UNDERLAYMENT PROPOSAL - xx.docx
+++ b/backend/templates/Gyp/xx TREADWELL UNDERLAYMENT PROPOSAL - xx.docx
@@ -749,7 +749,6 @@
                                 <w:color w:val="404040" w:themeColor="text1" w:themeTint="BF"/>
                                 <w:sz w:val="18"/>
                                 <w:szCs w:val="18"/>
-                                <w:highlight w:val="yellow"/>
                                 <w:u w:val="single"/>
                               </w:rPr>
                               <w:t/>
@@ -821,7 +820,6 @@
                                 <w:color w:val="404040" w:themeColor="text1" w:themeTint="BF"/>
                                 <w:sz w:val="18"/>
                                 <w:szCs w:val="18"/>
-                                <w:highlight w:val="yellow"/>
                               </w:rPr>
                               <w:t/>
                             </w:r>
@@ -833,7 +831,6 @@
                                 <w:color w:val="404040" w:themeColor="text1" w:themeTint="BF"/>
                                 <w:sz w:val="18"/>
                                 <w:szCs w:val="18"/>
-                                <w:highlight w:val="yellow"/>
                                 <w:u w:val="single"/>
                               </w:rPr>
                               <w:t/>
@@ -846,7 +843,6 @@
                                 <w:color w:val="404040" w:themeColor="text1" w:themeTint="BF"/>
                                 <w:sz w:val="18"/>
                                 <w:szCs w:val="18"/>
-                                <w:highlight w:val="yellow"/>
                               </w:rPr>
                               <w:t/>
                             </w:r>
@@ -1031,7 +1027,6 @@
                                 <w:color w:val="404040" w:themeColor="text1" w:themeTint="BF"/>
                                 <w:sz w:val="18"/>
                                 <w:szCs w:val="18"/>
-                                <w:highlight w:val="yellow"/>
                               </w:rPr>
                               <w:t/>
                             </w:r>
@@ -1041,7 +1036,6 @@
                                 <w:color w:val="404040" w:themeColor="text1" w:themeTint="BF"/>
                                 <w:sz w:val="17"/>
                                 <w:szCs w:val="17"/>
-                                <w:highlight w:val="yellow"/>
                               </w:rPr>
                               <w:t xml:space="preserve"/>
                             </w:r>
@@ -1051,7 +1045,6 @@
                                 <w:color w:val="404040" w:themeColor="text1" w:themeTint="BF"/>
                                 <w:sz w:val="17"/>
                                 <w:szCs w:val="17"/>
-                                <w:highlight w:val="yellow"/>
                               </w:rPr>
                               <w:t xml:space="preserve"/>
                             </w:r>
@@ -1081,7 +1074,6 @@
                                 <w:color w:val="404040" w:themeColor="text1" w:themeTint="BF"/>
                                 <w:sz w:val="18"/>
                                 <w:szCs w:val="18"/>
-                                <w:highlight w:val="cyan"/>
                                 <w:u w:val="single"/>
                               </w:rPr>
                               <w:t/>
@@ -1392,7 +1384,6 @@
                                 <w:color w:val="404040" w:themeColor="text1" w:themeTint="BF"/>
                                 <w:sz w:val="18"/>
                                 <w:szCs w:val="18"/>
-                                <w:highlight w:val="yellow"/>
                               </w:rPr>
                               <w:t/>
                             </w:r>
@@ -1402,7 +1393,6 @@
                                 <w:color w:val="404040" w:themeColor="text1" w:themeTint="BF"/>
                                 <w:sz w:val="17"/>
                                 <w:szCs w:val="17"/>
-                                <w:highlight w:val="yellow"/>
                               </w:rPr>
                               <w:t xml:space="preserve"/>
                             </w:r>
@@ -1486,7 +1476,6 @@
                                 <w:color w:val="404040" w:themeColor="text1" w:themeTint="BF"/>
                                 <w:sz w:val="18"/>
                                 <w:szCs w:val="18"/>
-                                <w:highlight w:val="cyan"/>
                                 <w:u w:val="single"/>
                               </w:rPr>
                               <w:t/>
@@ -1541,7 +1530,6 @@
                                 <w:color w:val="404040" w:themeColor="text1" w:themeTint="BF"/>
                                 <w:sz w:val="17"/>
                                 <w:szCs w:val="17"/>
-                                <w:highlight w:val="yellow"/>
                                 <w:u w:val="single"/>
                               </w:rPr>
                               <w:t/>
@@ -1554,7 +1542,6 @@
                                 <w:color w:val="404040" w:themeColor="text1" w:themeTint="BF"/>
                                 <w:sz w:val="17"/>
                                 <w:szCs w:val="17"/>
-                                <w:highlight w:val="yellow"/>
                                 <w:u w:val="single"/>
                               </w:rPr>
                               <w:t/>
@@ -1567,7 +1554,6 @@
                                 <w:color w:val="404040" w:themeColor="text1" w:themeTint="BF"/>
                                 <w:sz w:val="16"/>
                                 <w:szCs w:val="16"/>
-                                <w:highlight w:val="yellow"/>
                                 <w:u w:val="single"/>
                               </w:rPr>
                               <w:t xml:space="preserve"/>
@@ -1578,7 +1564,6 @@
                                 <w:color w:val="404040" w:themeColor="text1" w:themeTint="BF"/>
                                 <w:sz w:val="16"/>
                                 <w:szCs w:val="16"/>
-                                <w:highlight w:val="yellow"/>
                                 <w:u w:val="single"/>
                               </w:rPr>
                               <w:t/>
@@ -1591,7 +1576,6 @@
                                 <w:color w:val="404040" w:themeColor="text1" w:themeTint="BF"/>
                                 <w:sz w:val="16"/>
                                 <w:szCs w:val="16"/>
-                                <w:highlight w:val="yellow"/>
                                 <w:u w:val="single"/>
                               </w:rPr>
                               <w:t xml:space="preserve"/>
@@ -1604,7 +1588,6 @@
                                 <w:color w:val="404040" w:themeColor="text1" w:themeTint="BF"/>
                                 <w:sz w:val="18"/>
                                 <w:szCs w:val="18"/>
-                                <w:highlight w:val="yellow"/>
                                 <w:u w:val="single"/>
                               </w:rPr>
                               <w:t/>
@@ -1615,7 +1598,6 @@
                                 <w:color w:val="404040" w:themeColor="text1" w:themeTint="BF"/>
                                 <w:sz w:val="16"/>
                                 <w:szCs w:val="16"/>
-                                <w:highlight w:val="yellow"/>
                                 <w:u w:val="single"/>
                               </w:rPr>
                               <w:t/>
@@ -1628,7 +1610,6 @@
                                 <w:color w:val="404040" w:themeColor="text1" w:themeTint="BF"/>
                                 <w:sz w:val="18"/>
                                 <w:szCs w:val="18"/>
-                                <w:highlight w:val="yellow"/>
                                 <w:u w:val="single"/>
                               </w:rPr>
                               <w:t/>
@@ -1674,7 +1655,6 @@
                                 <w:color w:val="404040" w:themeColor="text1" w:themeTint="BF"/>
                                 <w:sz w:val="18"/>
                                 <w:szCs w:val="18"/>
-                                <w:highlight w:val="yellow"/>
                               </w:rPr>
                               <w:t xml:space="preserve">USG </w:t>
                             </w:r>
@@ -1921,7 +1901,6 @@
                                 <w:color w:val="404040" w:themeColor="text1" w:themeTint="BF"/>
                                 <w:sz w:val="18"/>
                                 <w:szCs w:val="18"/>
-                                <w:highlight w:val="yellow"/>
                               </w:rPr>
                               <w:t/>
                             </w:r>
@@ -1931,7 +1910,6 @@
                                 <w:color w:val="404040" w:themeColor="text1" w:themeTint="BF"/>
                                 <w:sz w:val="17"/>
                                 <w:szCs w:val="17"/>
-                                <w:highlight w:val="yellow"/>
                               </w:rPr>
                               <w:t xml:space="preserve"/>
                             </w:r>
@@ -1979,7 +1957,6 @@
                                 <w:color w:val="404040" w:themeColor="text1" w:themeTint="BF"/>
                                 <w:sz w:val="18"/>
                                 <w:szCs w:val="18"/>
-                                <w:highlight w:val="cyan"/>
                                 <w:u w:val="single"/>
                               </w:rPr>
                               <w:t/>
@@ -3873,7 +3850,6 @@
                                 <w:color w:val="404040" w:themeColor="text1" w:themeTint="BF"/>
                                 <w:sz w:val="18"/>
                                 <w:szCs w:val="18"/>
-                                <w:highlight w:val="yellow"/>
                               </w:rPr>
                               <w:t>GC to provide 500</w:t>
                             </w:r>
@@ -3883,7 +3859,6 @@
                                 <w:color w:val="404040" w:themeColor="text1" w:themeTint="BF"/>
                                 <w:sz w:val="16"/>
                                 <w:szCs w:val="16"/>
-                                <w:highlight w:val="yellow"/>
                               </w:rPr>
                               <w:t xml:space="preserve"> sf of </w:t>
                             </w:r>
@@ -3893,7 +3868,6 @@
                                 <w:color w:val="404040" w:themeColor="text1" w:themeTint="BF"/>
                                 <w:sz w:val="18"/>
                                 <w:szCs w:val="18"/>
-                                <w:highlight w:val="yellow"/>
                               </w:rPr>
                               <w:t xml:space="preserve">Onsite Covered </w:t>
                             </w:r>
@@ -3903,7 +3877,6 @@
                                 <w:color w:val="404040" w:themeColor="text1" w:themeTint="BF"/>
                                 <w:sz w:val="18"/>
                                 <w:szCs w:val="18"/>
-                                <w:highlight w:val="yellow"/>
                               </w:rPr>
                               <w:t xml:space="preserve">Sound Mat </w:t>
                             </w:r>
@@ -3913,7 +3886,6 @@
                                 <w:color w:val="404040" w:themeColor="text1" w:themeTint="BF"/>
                                 <w:sz w:val="18"/>
                                 <w:szCs w:val="18"/>
-                                <w:highlight w:val="yellow"/>
                               </w:rPr>
                               <w:t>Storage</w:t>
                             </w:r>
@@ -3923,7 +3895,6 @@
                                 <w:color w:val="404040" w:themeColor="text1" w:themeTint="BF"/>
                                 <w:sz w:val="17"/>
                                 <w:szCs w:val="17"/>
-                                <w:highlight w:val="yellow"/>
                               </w:rPr>
                               <w:t xml:space="preserve">, </w:t>
                             </w:r>
@@ -3935,7 +3906,6 @@
                                 <w:color w:val="404040" w:themeColor="text1" w:themeTint="BF"/>
                                 <w:sz w:val="17"/>
                                 <w:szCs w:val="17"/>
-                                <w:highlight w:val="yellow"/>
                               </w:rPr>
                               <w:t>if applicable</w:t>
                             </w:r>
@@ -3945,7 +3915,6 @@
                                 <w:color w:val="404040" w:themeColor="text1" w:themeTint="BF"/>
                                 <w:sz w:val="18"/>
                                 <w:szCs w:val="18"/>
-                                <w:highlight w:val="yellow"/>
                               </w:rPr>
                               <w:t xml:space="preserve"> </w:t>
                             </w:r>
@@ -3957,7 +3926,6 @@
                                 <w:color w:val="404040" w:themeColor="text1" w:themeTint="BF"/>
                                 <w:sz w:val="18"/>
                                 <w:szCs w:val="18"/>
-                                <w:highlight w:val="yellow"/>
                               </w:rPr>
                               <w:t>(</w:t>
                             </w:r>
@@ -3969,7 +3937,6 @@
                                 <w:color w:val="404040" w:themeColor="text1" w:themeTint="BF"/>
                                 <w:sz w:val="16"/>
                                 <w:szCs w:val="16"/>
-                                <w:highlight w:val="yellow"/>
                               </w:rPr>
                               <w:t>see add if not available</w:t>
                             </w:r>
@@ -3981,7 +3948,6 @@
                                 <w:color w:val="404040" w:themeColor="text1" w:themeTint="BF"/>
                                 <w:sz w:val="18"/>
                                 <w:szCs w:val="18"/>
-                                <w:highlight w:val="yellow"/>
                               </w:rPr>
                               <w:t>)</w:t>
                             </w:r>
@@ -4109,7 +4075,6 @@
                           <w:color w:val="404040" w:themeColor="text1" w:themeTint="BF"/>
                           <w:sz w:val="18"/>
                           <w:szCs w:val="18"/>
-                          <w:highlight w:val="yellow"/>
                           <w:u w:val="single"/>
                         </w:rPr>
                         <w:t/>
@@ -4181,7 +4146,6 @@
                           <w:color w:val="404040" w:themeColor="text1" w:themeTint="BF"/>
                           <w:sz w:val="18"/>
                           <w:szCs w:val="18"/>
-                          <w:highlight w:val="yellow"/>
                         </w:rPr>
                         <w:t/>
                       </w:r>
@@ -4193,7 +4157,6 @@
                           <w:color w:val="404040" w:themeColor="text1" w:themeTint="BF"/>
                           <w:sz w:val="18"/>
                           <w:szCs w:val="18"/>
-                          <w:highlight w:val="yellow"/>
                           <w:u w:val="single"/>
                         </w:rPr>
                         <w:t/>
@@ -4206,7 +4169,6 @@
                           <w:color w:val="404040" w:themeColor="text1" w:themeTint="BF"/>
                           <w:sz w:val="18"/>
                           <w:szCs w:val="18"/>
-                          <w:highlight w:val="yellow"/>
                         </w:rPr>
                         <w:t/>
                       </w:r>
@@ -4391,7 +4353,6 @@
                           <w:color w:val="404040" w:themeColor="text1" w:themeTint="BF"/>
                           <w:sz w:val="18"/>
                           <w:szCs w:val="18"/>
-                          <w:highlight w:val="yellow"/>
                         </w:rPr>
                         <w:t/>
                       </w:r>
@@ -4401,7 +4362,6 @@
                           <w:color w:val="404040" w:themeColor="text1" w:themeTint="BF"/>
                           <w:sz w:val="17"/>
                           <w:szCs w:val="17"/>
-                          <w:highlight w:val="yellow"/>
                         </w:rPr>
                         <w:t xml:space="preserve"/>
                       </w:r>
@@ -4411,7 +4371,6 @@
                           <w:color w:val="404040" w:themeColor="text1" w:themeTint="BF"/>
                           <w:sz w:val="17"/>
                           <w:szCs w:val="17"/>
-                          <w:highlight w:val="yellow"/>
                         </w:rPr>
                         <w:t xml:space="preserve"/>
                       </w:r>
@@ -4441,7 +4400,6 @@
                           <w:color w:val="404040" w:themeColor="text1" w:themeTint="BF"/>
                           <w:sz w:val="18"/>
                           <w:szCs w:val="18"/>
-                          <w:highlight w:val="cyan"/>
                           <w:u w:val="single"/>
                         </w:rPr>
                         <w:t/>
@@ -4752,7 +4710,6 @@
                           <w:color w:val="404040" w:themeColor="text1" w:themeTint="BF"/>
                           <w:sz w:val="18"/>
                           <w:szCs w:val="18"/>
-                          <w:highlight w:val="yellow"/>
                         </w:rPr>
                         <w:t/>
                       </w:r>
@@ -4762,7 +4719,6 @@
                           <w:color w:val="404040" w:themeColor="text1" w:themeTint="BF"/>
                           <w:sz w:val="17"/>
                           <w:szCs w:val="17"/>
-                          <w:highlight w:val="yellow"/>
                         </w:rPr>
                         <w:t xml:space="preserve"/>
                       </w:r>
@@ -4846,7 +4802,6 @@
                           <w:color w:val="404040" w:themeColor="text1" w:themeTint="BF"/>
                           <w:sz w:val="18"/>
                           <w:szCs w:val="18"/>
-                          <w:highlight w:val="cyan"/>
                           <w:u w:val="single"/>
                         </w:rPr>
                         <w:t/>
@@ -4901,7 +4856,6 @@
                           <w:color w:val="404040" w:themeColor="text1" w:themeTint="BF"/>
                           <w:sz w:val="17"/>
                           <w:szCs w:val="17"/>
-                          <w:highlight w:val="yellow"/>
                           <w:u w:val="single"/>
                         </w:rPr>
                         <w:t/>
@@ -4914,7 +4868,6 @@
                           <w:color w:val="404040" w:themeColor="text1" w:themeTint="BF"/>
                           <w:sz w:val="17"/>
                           <w:szCs w:val="17"/>
-                          <w:highlight w:val="yellow"/>
                           <w:u w:val="single"/>
                         </w:rPr>
                         <w:t/>
@@ -4927,7 +4880,6 @@
                           <w:color w:val="404040" w:themeColor="text1" w:themeTint="BF"/>
                           <w:sz w:val="16"/>
                           <w:szCs w:val="16"/>
-                          <w:highlight w:val="yellow"/>
                           <w:u w:val="single"/>
                         </w:rPr>
                         <w:t xml:space="preserve"/>
@@ -4938,7 +4890,6 @@
                           <w:color w:val="404040" w:themeColor="text1" w:themeTint="BF"/>
                           <w:sz w:val="16"/>
                           <w:szCs w:val="16"/>
-                          <w:highlight w:val="yellow"/>
                           <w:u w:val="single"/>
                         </w:rPr>
                         <w:t/>
@@ -4951,7 +4902,6 @@
                           <w:color w:val="404040" w:themeColor="text1" w:themeTint="BF"/>
                           <w:sz w:val="16"/>
                           <w:szCs w:val="16"/>
-                          <w:highlight w:val="yellow"/>
                           <w:u w:val="single"/>
                         </w:rPr>
                         <w:t xml:space="preserve"/>
@@ -4964,7 +4914,6 @@
                           <w:color w:val="404040" w:themeColor="text1" w:themeTint="BF"/>
                           <w:sz w:val="18"/>
                           <w:szCs w:val="18"/>
-                          <w:highlight w:val="yellow"/>
                           <w:u w:val="single"/>
                         </w:rPr>
                         <w:t/>
@@ -4975,7 +4924,6 @@
                           <w:color w:val="404040" w:themeColor="text1" w:themeTint="BF"/>
                           <w:sz w:val="16"/>
                           <w:szCs w:val="16"/>
-                          <w:highlight w:val="yellow"/>
                           <w:u w:val="single"/>
                         </w:rPr>
                         <w:t/>
@@ -4988,7 +4936,6 @@
                           <w:color w:val="404040" w:themeColor="text1" w:themeTint="BF"/>
                           <w:sz w:val="18"/>
                           <w:szCs w:val="18"/>
-                          <w:highlight w:val="yellow"/>
                           <w:u w:val="single"/>
                         </w:rPr>
                         <w:t/>
@@ -5034,7 +4981,6 @@
                           <w:color w:val="404040" w:themeColor="text1" w:themeTint="BF"/>
                           <w:sz w:val="18"/>
                           <w:szCs w:val="18"/>
-                          <w:highlight w:val="yellow"/>
                         </w:rPr>
                         <w:t xml:space="preserve">USG </w:t>
                       </w:r>
@@ -5281,7 +5227,6 @@
                           <w:color w:val="404040" w:themeColor="text1" w:themeTint="BF"/>
                           <w:sz w:val="18"/>
                           <w:szCs w:val="18"/>
-                          <w:highlight w:val="yellow"/>
                         </w:rPr>
                         <w:t/>
                       </w:r>
@@ -5291,7 +5236,6 @@
                           <w:color w:val="404040" w:themeColor="text1" w:themeTint="BF"/>
                           <w:sz w:val="17"/>
                           <w:szCs w:val="17"/>
-                          <w:highlight w:val="yellow"/>
                         </w:rPr>
                         <w:t xml:space="preserve"/>
                       </w:r>
@@ -5339,7 +5283,6 @@
                           <w:color w:val="404040" w:themeColor="text1" w:themeTint="BF"/>
                           <w:sz w:val="18"/>
                           <w:szCs w:val="18"/>
-                          <w:highlight w:val="cyan"/>
                           <w:u w:val="single"/>
                         </w:rPr>
                         <w:t/>
@@ -7233,7 +7176,6 @@
                           <w:color w:val="404040" w:themeColor="text1" w:themeTint="BF"/>
                           <w:sz w:val="18"/>
                           <w:szCs w:val="18"/>
-                          <w:highlight w:val="yellow"/>
                         </w:rPr>
                         <w:t>GC to provide 500</w:t>
                       </w:r>
@@ -7243,7 +7185,6 @@
                           <w:color w:val="404040" w:themeColor="text1" w:themeTint="BF"/>
                           <w:sz w:val="16"/>
                           <w:szCs w:val="16"/>
-                          <w:highlight w:val="yellow"/>
                         </w:rPr>
                         <w:t xml:space="preserve"> sf of </w:t>
                       </w:r>
@@ -7253,7 +7194,6 @@
                           <w:color w:val="404040" w:themeColor="text1" w:themeTint="BF"/>
                           <w:sz w:val="18"/>
                           <w:szCs w:val="18"/>
-                          <w:highlight w:val="yellow"/>
                         </w:rPr>
                         <w:t xml:space="preserve">Onsite Covered </w:t>
                       </w:r>
@@ -7263,7 +7203,6 @@
                           <w:color w:val="404040" w:themeColor="text1" w:themeTint="BF"/>
                           <w:sz w:val="18"/>
                           <w:szCs w:val="18"/>
-                          <w:highlight w:val="yellow"/>
                         </w:rPr>
                         <w:t xml:space="preserve">Sound Mat </w:t>
                       </w:r>
@@ -7273,7 +7212,6 @@
                           <w:color w:val="404040" w:themeColor="text1" w:themeTint="BF"/>
                           <w:sz w:val="18"/>
                           <w:szCs w:val="18"/>
-                          <w:highlight w:val="yellow"/>
                         </w:rPr>
                         <w:t>Storage</w:t>
                       </w:r>
@@ -7283,7 +7221,6 @@
                           <w:color w:val="404040" w:themeColor="text1" w:themeTint="BF"/>
                           <w:sz w:val="17"/>
                           <w:szCs w:val="17"/>
-                          <w:highlight w:val="yellow"/>
                         </w:rPr>
                         <w:t xml:space="preserve">, </w:t>
                       </w:r>
@@ -7295,7 +7232,6 @@
                           <w:color w:val="404040" w:themeColor="text1" w:themeTint="BF"/>
                           <w:sz w:val="17"/>
                           <w:szCs w:val="17"/>
-                          <w:highlight w:val="yellow"/>
                         </w:rPr>
                         <w:t>if applicable</w:t>
                       </w:r>
@@ -7305,7 +7241,6 @@
                           <w:color w:val="404040" w:themeColor="text1" w:themeTint="BF"/>
                           <w:sz w:val="18"/>
                           <w:szCs w:val="18"/>
-                          <w:highlight w:val="yellow"/>
                         </w:rPr>
                         <w:t xml:space="preserve"> </w:t>
                       </w:r>
@@ -7317,7 +7252,6 @@
                           <w:color w:val="404040" w:themeColor="text1" w:themeTint="BF"/>
                           <w:sz w:val="18"/>
                           <w:szCs w:val="18"/>
-                          <w:highlight w:val="yellow"/>
                         </w:rPr>
                         <w:t>(</w:t>
                       </w:r>
@@ -7329,7 +7263,6 @@
                           <w:color w:val="404040" w:themeColor="text1" w:themeTint="BF"/>
                           <w:sz w:val="16"/>
                           <w:szCs w:val="16"/>
-                          <w:highlight w:val="yellow"/>
                         </w:rPr>
                         <w:t>see add if not available</w:t>
                       </w:r>
@@ -7341,7 +7274,6 @@
                           <w:color w:val="404040" w:themeColor="text1" w:themeTint="BF"/>
                           <w:sz w:val="18"/>
                           <w:szCs w:val="18"/>
-                          <w:highlight w:val="yellow"/>
                         </w:rPr>
                         <w:t>)</w:t>
                       </w:r>
@@ -7525,7 +7457,7 @@
                                 <w:sz w:val="20"/>
                                 <w:szCs w:val="20"/>
                               </w:rPr>
-                              <w:t xml:space="preserve">{{base_bid_formatted}} – Gypsum Underlayment System as described above (material sales tax INCLUDED)</w:t>
+                              <w:t xml:space="preserve">{{base_bid_formatted}} – Gypsum Underlayment System as described above {{base_tax_phrase}}</w:t>
                             </w:r>
                             <w:r>
                               <w:rPr>
@@ -7613,7 +7545,6 @@
                                 <w:color w:val="404040" w:themeColor="text1" w:themeTint="BF"/>
                                 <w:sz w:val="18"/>
                                 <w:szCs w:val="18"/>
-                                <w:highlight w:val="yellow"/>
                                 <w:u w:val="single"/>
                               </w:rPr>
                               <w:t/>
@@ -7626,7 +7557,6 @@
                                 <w:color w:val="404040" w:themeColor="text1" w:themeTint="BF"/>
                                 <w:sz w:val="18"/>
                                 <w:szCs w:val="18"/>
-                                <w:highlight w:val="yellow"/>
                               </w:rPr>
                               <w:t/>
                             </w:r>
@@ -7663,7 +7593,6 @@
                                 <w:color w:val="404040" w:themeColor="text1" w:themeTint="BF"/>
                                 <w:sz w:val="18"/>
                                 <w:szCs w:val="18"/>
-                                <w:highlight w:val="yellow"/>
                               </w:rPr>
                               <w:t xml:space="preserve">{{material_tax_formatted}} – Material Sales Tax</w:t>
                             </w:r>
@@ -7673,7 +7602,6 @@
                                 <w:color w:val="404040" w:themeColor="text1" w:themeTint="BF"/>
                                 <w:sz w:val="18"/>
                                 <w:szCs w:val="18"/>
-                                <w:highlight w:val="yellow"/>
                               </w:rPr>
                               <w:t xml:space="preserve"/>
                             </w:r>
@@ -7683,7 +7611,6 @@
                                 <w:color w:val="404040" w:themeColor="text1" w:themeTint="BF"/>
                                 <w:sz w:val="18"/>
                                 <w:szCs w:val="18"/>
-                                <w:highlight w:val="yellow"/>
                               </w:rPr>
                               <w:t/>
                             </w:r>
@@ -7693,7 +7620,6 @@
                                 <w:color w:val="404040" w:themeColor="text1" w:themeTint="BF"/>
                                 <w:sz w:val="18"/>
                                 <w:szCs w:val="18"/>
-                                <w:highlight w:val="yellow"/>
                               </w:rPr>
                               <w:t xml:space="preserve"/>
                             </w:r>
@@ -7703,7 +7629,6 @@
                                 <w:color w:val="404040" w:themeColor="text1" w:themeTint="BF"/>
                                 <w:sz w:val="18"/>
                                 <w:szCs w:val="18"/>
-                                <w:highlight w:val="yellow"/>
                               </w:rPr>
                               <w:t/>
                             </w:r>
@@ -7713,7 +7638,6 @@
                                 <w:color w:val="404040" w:themeColor="text1" w:themeTint="BF"/>
                                 <w:sz w:val="18"/>
                                 <w:szCs w:val="18"/>
-                                <w:highlight w:val="yellow"/>
                               </w:rPr>
                               <w:t/>
                             </w:r>
@@ -7723,7 +7647,6 @@
                                 <w:color w:val="404040" w:themeColor="text1" w:themeTint="BF"/>
                                 <w:sz w:val="18"/>
                                 <w:szCs w:val="18"/>
-                                <w:highlight w:val="yellow"/>
                               </w:rPr>
                               <w:t/>
                             </w:r>
@@ -7758,7 +7681,6 @@
                                 <w:color w:val="404040" w:themeColor="text1" w:themeTint="BF"/>
                                 <w:sz w:val="18"/>
                                 <w:szCs w:val="18"/>
-                                <w:highlight w:val="yellow"/>
                                 <w:u w:val="single"/>
                               </w:rPr>
                               <w:t xml:space="preserve">{{tax_amount_formatted}} – Kansas Remodel Tax</w:t>
@@ -7769,7 +7691,6 @@
                                 <w:color w:val="404040" w:themeColor="text1" w:themeTint="BF"/>
                                 <w:sz w:val="18"/>
                                 <w:szCs w:val="18"/>
-                                <w:highlight w:val="yellow"/>
                                 <w:u w:val="single"/>
                               </w:rPr>
                               <w:t xml:space="preserve"/>
@@ -7780,7 +7701,6 @@
                                 <w:color w:val="404040" w:themeColor="text1" w:themeTint="BF"/>
                                 <w:sz w:val="18"/>
                                 <w:szCs w:val="18"/>
-                                <w:highlight w:val="yellow"/>
                                 <w:u w:val="single"/>
                               </w:rPr>
                               <w:t xml:space="preserve"/>
@@ -7791,7 +7711,6 @@
                                 <w:color w:val="404040" w:themeColor="text1" w:themeTint="BF"/>
                                 <w:sz w:val="18"/>
                                 <w:szCs w:val="18"/>
-                                <w:highlight w:val="yellow"/>
                               </w:rPr>
                               <w:t/>
                             </w:r>
@@ -8198,7 +8117,7 @@
                           <w:sz w:val="20"/>
                           <w:szCs w:val="20"/>
                         </w:rPr>
-                        <w:t xml:space="preserve">{{base_bid_formatted}} – Gypsum Underlayment System as described above (material sales tax INCLUDED)</w:t>
+                        <w:t xml:space="preserve">{{base_bid_formatted}} – Gypsum Underlayment System as described above {{base_tax_phrase}}</w:t>
                       </w:r>
                       <w:r>
                         <w:rPr>
@@ -8286,7 +8205,6 @@
                           <w:color w:val="404040" w:themeColor="text1" w:themeTint="BF"/>
                           <w:sz w:val="18"/>
                           <w:szCs w:val="18"/>
-                          <w:highlight w:val="yellow"/>
                           <w:u w:val="single"/>
                         </w:rPr>
                         <w:t/>
@@ -8299,7 +8217,6 @@
                           <w:color w:val="404040" w:themeColor="text1" w:themeTint="BF"/>
                           <w:sz w:val="18"/>
                           <w:szCs w:val="18"/>
-                          <w:highlight w:val="yellow"/>
                         </w:rPr>
                         <w:t/>
                       </w:r>
@@ -8336,7 +8253,6 @@
                           <w:color w:val="404040" w:themeColor="text1" w:themeTint="BF"/>
                           <w:sz w:val="18"/>
                           <w:szCs w:val="18"/>
-                          <w:highlight w:val="yellow"/>
                         </w:rPr>
                         <w:t xml:space="preserve">{{material_tax_formatted}} – Material Sales Tax</w:t>
                       </w:r>
@@ -8346,7 +8262,6 @@
                           <w:color w:val="404040" w:themeColor="text1" w:themeTint="BF"/>
                           <w:sz w:val="18"/>
                           <w:szCs w:val="18"/>
-                          <w:highlight w:val="yellow"/>
                         </w:rPr>
                         <w:t xml:space="preserve"/>
                       </w:r>
@@ -8356,7 +8271,6 @@
                           <w:color w:val="404040" w:themeColor="text1" w:themeTint="BF"/>
                           <w:sz w:val="18"/>
                           <w:szCs w:val="18"/>
-                          <w:highlight w:val="yellow"/>
                         </w:rPr>
                         <w:t/>
                       </w:r>
@@ -8366,7 +8280,6 @@
                           <w:color w:val="404040" w:themeColor="text1" w:themeTint="BF"/>
                           <w:sz w:val="18"/>
                           <w:szCs w:val="18"/>
-                          <w:highlight w:val="yellow"/>
                         </w:rPr>
                         <w:t xml:space="preserve"/>
                       </w:r>
@@ -8376,7 +8289,6 @@
                           <w:color w:val="404040" w:themeColor="text1" w:themeTint="BF"/>
                           <w:sz w:val="18"/>
                           <w:szCs w:val="18"/>
-                          <w:highlight w:val="yellow"/>
                         </w:rPr>
                         <w:t/>
                       </w:r>
@@ -8386,7 +8298,6 @@
                           <w:color w:val="404040" w:themeColor="text1" w:themeTint="BF"/>
                           <w:sz w:val="18"/>
                           <w:szCs w:val="18"/>
-                          <w:highlight w:val="yellow"/>
                         </w:rPr>
                         <w:t/>
                       </w:r>
@@ -8396,7 +8307,6 @@
                           <w:color w:val="404040" w:themeColor="text1" w:themeTint="BF"/>
                           <w:sz w:val="18"/>
                           <w:szCs w:val="18"/>
-                          <w:highlight w:val="yellow"/>
                         </w:rPr>
                         <w:t/>
                       </w:r>
@@ -8431,7 +8341,6 @@
                           <w:color w:val="404040" w:themeColor="text1" w:themeTint="BF"/>
                           <w:sz w:val="18"/>
                           <w:szCs w:val="18"/>
-                          <w:highlight w:val="yellow"/>
                           <w:u w:val="single"/>
                         </w:rPr>
                         <w:t xml:space="preserve">{{tax_amount_formatted}} – Kansas Remodel Tax</w:t>
@@ -8442,7 +8351,6 @@
                           <w:color w:val="404040" w:themeColor="text1" w:themeTint="BF"/>
                           <w:sz w:val="18"/>
                           <w:szCs w:val="18"/>
-                          <w:highlight w:val="yellow"/>
                           <w:u w:val="single"/>
                         </w:rPr>
                         <w:t xml:space="preserve"/>
@@ -8453,7 +8361,6 @@
                           <w:color w:val="404040" w:themeColor="text1" w:themeTint="BF"/>
                           <w:sz w:val="18"/>
                           <w:szCs w:val="18"/>
-                          <w:highlight w:val="yellow"/>
                           <w:u w:val="single"/>
                         </w:rPr>
                         <w:t xml:space="preserve"/>
@@ -8464,7 +8371,6 @@
                           <w:color w:val="404040" w:themeColor="text1" w:themeTint="BF"/>
                           <w:sz w:val="18"/>
                           <w:szCs w:val="18"/>
-                          <w:highlight w:val="yellow"/>
                         </w:rPr>
                         <w:t/>
                       </w:r>

</xml_diff>